<commit_message>
actualiza el numero total de pruebas en el documento de cobertura
</commit_message>
<xml_diff>
--- a/docs/Cobertura-Testing-IronDisk.docx
+++ b/docs/Cobertura-Testing-IronDisk.docx
@@ -208,7 +208,7 @@
         <w:spacing w:after="120"/>
       </w:pPr>
       <w:r>
-        <w:t xml:space="preserve">Hay 13 archivos de prueba y 56 pruebas en total. Se cubren las categorías pedidas: lógica pura, render de listas, render condicional, props, estado, eventos y uso de mocks.</w:t>
+        <w:t xml:space="preserve">Hay 18 archivos de prueba y 73 pruebas en total. Se cubren las categorías pedidas: lógica pura, render de listas, render condicional, props, estado, eventos y uso de mocks.</w:t>
       </w:r>
     </w:p>
     <w:tbl>
@@ -640,7 +640,7 @@
                 <w:sz w:val="20"/>
                 <w:szCs w:val="20"/>
               </w:rPr>
-              <w:t xml:space="preserve">3</w:t>
+              <w:t xml:space="preserve">5</w:t>
             </w:r>
           </w:p>
         </w:tc>
@@ -668,7 +668,7 @@
                 <w:sz w:val="20"/>
                 <w:szCs w:val="20"/>
               </w:rPr>
-              <w:t xml:space="preserve">Sin filtros, búsqueda por texto y combinación de categoría y formato</w:t>
+              <w:t xml:space="preserve">Sin filtros, búsqueda por texto y combinación de categoría y formato (productos); texto por nombre, apellidos o correo (usuarios)</w:t>
             </w:r>
           </w:p>
         </w:tc>
@@ -1867,6 +1867,591 @@
                 <w:szCs w:val="20"/>
               </w:rPr>
               <w:t xml:space="preserve">Mock de window.confirm y localStorage</w:t>
+            </w:r>
+          </w:p>
+        </w:tc>
+      </w:tr>
+      <w:tr>
+        <w:trPr>
+          <w:tblHeader w:val="off"/>
+        </w:trPr>
+        <w:tc>
+          <w:tcPr>
+            <w:tcW w:type="dxa" w:w="2500"/>
+            <w:tcBorders>
+              <w:top w:val="single" w:color="999999" w:sz="4"/>
+              <w:left w:val="single" w:color="999999" w:sz="4"/>
+              <w:bottom w:val="single" w:color="999999" w:sz="4"/>
+              <w:right w:val="single" w:color="999999" w:sz="4"/>
+            </w:tcBorders>
+            <w:tcMar>
+              <w:top w:type="dxa" w:w="60"/>
+              <w:left w:type="dxa" w:w="100"/>
+              <w:bottom w:type="dxa" w:w="60"/>
+              <w:right w:type="dxa" w:w="100"/>
+            </w:tcMar>
+          </w:tcPr>
+          <w:p>
+            <w:r>
+              <w:rPr>
+                <w:b w:val="false"/>
+                <w:bCs w:val="false"/>
+                <w:sz w:val="20"/>
+                <w:szCs w:val="20"/>
+              </w:rPr>
+              <w:t xml:space="preserve">AdminUsuarios.spec.js</w:t>
+            </w:r>
+          </w:p>
+        </w:tc>
+        <w:tc>
+          <w:tcPr>
+            <w:tcW w:type="dxa" w:w="700"/>
+            <w:tcBorders>
+              <w:top w:val="single" w:color="999999" w:sz="4"/>
+              <w:left w:val="single" w:color="999999" w:sz="4"/>
+              <w:bottom w:val="single" w:color="999999" w:sz="4"/>
+              <w:right w:val="single" w:color="999999" w:sz="4"/>
+            </w:tcBorders>
+            <w:tcMar>
+              <w:top w:type="dxa" w:w="60"/>
+              <w:left w:type="dxa" w:w="100"/>
+              <w:bottom w:type="dxa" w:w="60"/>
+              <w:right w:type="dxa" w:w="100"/>
+            </w:tcMar>
+          </w:tcPr>
+          <w:p>
+            <w:r>
+              <w:rPr>
+                <w:b w:val="false"/>
+                <w:bCs w:val="false"/>
+                <w:sz w:val="20"/>
+                <w:szCs w:val="20"/>
+              </w:rPr>
+              <w:t xml:space="preserve">4</w:t>
+            </w:r>
+          </w:p>
+        </w:tc>
+        <w:tc>
+          <w:tcPr>
+            <w:tcW w:type="dxa" w:w="4300"/>
+            <w:tcBorders>
+              <w:top w:val="single" w:color="999999" w:sz="4"/>
+              <w:left w:val="single" w:color="999999" w:sz="4"/>
+              <w:bottom w:val="single" w:color="999999" w:sz="4"/>
+              <w:right w:val="single" w:color="999999" w:sz="4"/>
+            </w:tcBorders>
+            <w:tcMar>
+              <w:top w:type="dxa" w:w="60"/>
+              <w:left w:type="dxa" w:w="100"/>
+              <w:bottom w:type="dxa" w:w="60"/>
+              <w:right w:type="dxa" w:w="100"/>
+            </w:tcMar>
+          </w:tcPr>
+          <w:p>
+            <w:r>
+              <w:rPr>
+                <w:b w:val="false"/>
+                <w:bCs w:val="false"/>
+                <w:sz w:val="20"/>
+                <w:szCs w:val="20"/>
+              </w:rPr>
+              <w:t xml:space="preserve">Listado, confirmación antes de eliminar, eliminar al confirmar y buscador</w:t>
+            </w:r>
+          </w:p>
+        </w:tc>
+        <w:tc>
+          <w:tcPr>
+            <w:tcW w:type="dxa" w:w="1800"/>
+            <w:tcBorders>
+              <w:top w:val="single" w:color="999999" w:sz="4"/>
+              <w:left w:val="single" w:color="999999" w:sz="4"/>
+              <w:bottom w:val="single" w:color="999999" w:sz="4"/>
+              <w:right w:val="single" w:color="999999" w:sz="4"/>
+            </w:tcBorders>
+            <w:tcMar>
+              <w:top w:type="dxa" w:w="60"/>
+              <w:left w:type="dxa" w:w="100"/>
+              <w:bottom w:type="dxa" w:w="60"/>
+              <w:right w:type="dxa" w:w="100"/>
+            </w:tcMar>
+          </w:tcPr>
+          <w:p>
+            <w:r>
+              <w:rPr>
+                <w:b w:val="false"/>
+                <w:bCs w:val="false"/>
+                <w:sz w:val="20"/>
+                <w:szCs w:val="20"/>
+              </w:rPr>
+              <w:t xml:space="preserve">Mock de window.confirm y localStorage</w:t>
+            </w:r>
+          </w:p>
+        </w:tc>
+      </w:tr>
+      <w:tr>
+        <w:trPr>
+          <w:tblHeader w:val="off"/>
+        </w:trPr>
+        <w:tc>
+          <w:tcPr>
+            <w:tcW w:type="dxa" w:w="2500"/>
+            <w:tcBorders>
+              <w:top w:val="single" w:color="999999" w:sz="4"/>
+              <w:left w:val="single" w:color="999999" w:sz="4"/>
+              <w:bottom w:val="single" w:color="999999" w:sz="4"/>
+              <w:right w:val="single" w:color="999999" w:sz="4"/>
+            </w:tcBorders>
+            <w:tcMar>
+              <w:top w:type="dxa" w:w="60"/>
+              <w:left w:type="dxa" w:w="100"/>
+              <w:bottom w:type="dxa" w:w="60"/>
+              <w:right w:type="dxa" w:w="100"/>
+            </w:tcMar>
+          </w:tcPr>
+          <w:p>
+            <w:r>
+              <w:rPr>
+                <w:b w:val="false"/>
+                <w:bCs w:val="false"/>
+                <w:sz w:val="20"/>
+                <w:szCs w:val="20"/>
+              </w:rPr>
+              <w:t xml:space="preserve">UsuarioForm.spec.js</w:t>
+            </w:r>
+          </w:p>
+        </w:tc>
+        <w:tc>
+          <w:tcPr>
+            <w:tcW w:type="dxa" w:w="700"/>
+            <w:tcBorders>
+              <w:top w:val="single" w:color="999999" w:sz="4"/>
+              <w:left w:val="single" w:color="999999" w:sz="4"/>
+              <w:bottom w:val="single" w:color="999999" w:sz="4"/>
+              <w:right w:val="single" w:color="999999" w:sz="4"/>
+            </w:tcBorders>
+            <w:tcMar>
+              <w:top w:type="dxa" w:w="60"/>
+              <w:left w:type="dxa" w:w="100"/>
+              <w:bottom w:type="dxa" w:w="60"/>
+              <w:right w:type="dxa" w:w="100"/>
+            </w:tcMar>
+          </w:tcPr>
+          <w:p>
+            <w:r>
+              <w:rPr>
+                <w:b w:val="false"/>
+                <w:bCs w:val="false"/>
+                <w:sz w:val="20"/>
+                <w:szCs w:val="20"/>
+              </w:rPr>
+              <w:t xml:space="preserve">2</w:t>
+            </w:r>
+          </w:p>
+        </w:tc>
+        <w:tc>
+          <w:tcPr>
+            <w:tcW w:type="dxa" w:w="4300"/>
+            <w:tcBorders>
+              <w:top w:val="single" w:color="999999" w:sz="4"/>
+              <w:left w:val="single" w:color="999999" w:sz="4"/>
+              <w:bottom w:val="single" w:color="999999" w:sz="4"/>
+              <w:right w:val="single" w:color="999999" w:sz="4"/>
+            </w:tcBorders>
+            <w:tcMar>
+              <w:top w:type="dxa" w:w="60"/>
+              <w:left w:type="dxa" w:w="100"/>
+              <w:bottom w:type="dxa" w:w="60"/>
+              <w:right w:type="dxa" w:w="100"/>
+            </w:tcMar>
+          </w:tcPr>
+          <w:p>
+            <w:r>
+              <w:rPr>
+                <w:b w:val="false"/>
+                <w:bCs w:val="false"/>
+                <w:sz w:val="20"/>
+                <w:szCs w:val="20"/>
+              </w:rPr>
+              <w:t xml:space="preserve">RUN inválido no guarda y datos válidos crean el usuario</w:t>
+            </w:r>
+          </w:p>
+        </w:tc>
+        <w:tc>
+          <w:tcPr>
+            <w:tcW w:type="dxa" w:w="1800"/>
+            <w:tcBorders>
+              <w:top w:val="single" w:color="999999" w:sz="4"/>
+              <w:left w:val="single" w:color="999999" w:sz="4"/>
+              <w:bottom w:val="single" w:color="999999" w:sz="4"/>
+              <w:right w:val="single" w:color="999999" w:sz="4"/>
+            </w:tcBorders>
+            <w:tcMar>
+              <w:top w:type="dxa" w:w="60"/>
+              <w:left w:type="dxa" w:w="100"/>
+              <w:bottom w:type="dxa" w:w="60"/>
+              <w:right w:type="dxa" w:w="100"/>
+            </w:tcMar>
+          </w:tcPr>
+          <w:p>
+            <w:r>
+              <w:rPr>
+                <w:b w:val="false"/>
+                <w:bCs w:val="false"/>
+                <w:sz w:val="20"/>
+                <w:szCs w:val="20"/>
+              </w:rPr>
+              <w:t xml:space="preserve">Mock de localStorage</w:t>
+            </w:r>
+          </w:p>
+        </w:tc>
+      </w:tr>
+      <w:tr>
+        <w:trPr>
+          <w:tblHeader w:val="off"/>
+        </w:trPr>
+        <w:tc>
+          <w:tcPr>
+            <w:tcW w:type="dxa" w:w="2500"/>
+            <w:tcBorders>
+              <w:top w:val="single" w:color="999999" w:sz="4"/>
+              <w:left w:val="single" w:color="999999" w:sz="4"/>
+              <w:bottom w:val="single" w:color="999999" w:sz="4"/>
+              <w:right w:val="single" w:color="999999" w:sz="4"/>
+            </w:tcBorders>
+            <w:tcMar>
+              <w:top w:type="dxa" w:w="60"/>
+              <w:left w:type="dxa" w:w="100"/>
+              <w:bottom w:type="dxa" w:w="60"/>
+              <w:right w:type="dxa" w:w="100"/>
+            </w:tcMar>
+          </w:tcPr>
+          <w:p>
+            <w:r>
+              <w:rPr>
+                <w:b w:val="false"/>
+                <w:bCs w:val="false"/>
+                <w:sz w:val="20"/>
+                <w:szCs w:val="20"/>
+              </w:rPr>
+              <w:t xml:space="preserve">HistorialCompras.spec.js</w:t>
+            </w:r>
+          </w:p>
+        </w:tc>
+        <w:tc>
+          <w:tcPr>
+            <w:tcW w:type="dxa" w:w="700"/>
+            <w:tcBorders>
+              <w:top w:val="single" w:color="999999" w:sz="4"/>
+              <w:left w:val="single" w:color="999999" w:sz="4"/>
+              <w:bottom w:val="single" w:color="999999" w:sz="4"/>
+              <w:right w:val="single" w:color="999999" w:sz="4"/>
+            </w:tcBorders>
+            <w:tcMar>
+              <w:top w:type="dxa" w:w="60"/>
+              <w:left w:type="dxa" w:w="100"/>
+              <w:bottom w:type="dxa" w:w="60"/>
+              <w:right w:type="dxa" w:w="100"/>
+            </w:tcMar>
+          </w:tcPr>
+          <w:p>
+            <w:r>
+              <w:rPr>
+                <w:b w:val="false"/>
+                <w:bCs w:val="false"/>
+                <w:sz w:val="20"/>
+                <w:szCs w:val="20"/>
+              </w:rPr>
+              <w:t xml:space="preserve">3</w:t>
+            </w:r>
+          </w:p>
+        </w:tc>
+        <w:tc>
+          <w:tcPr>
+            <w:tcW w:type="dxa" w:w="4300"/>
+            <w:tcBorders>
+              <w:top w:val="single" w:color="999999" w:sz="4"/>
+              <w:left w:val="single" w:color="999999" w:sz="4"/>
+              <w:bottom w:val="single" w:color="999999" w:sz="4"/>
+              <w:right w:val="single" w:color="999999" w:sz="4"/>
+            </w:tcBorders>
+            <w:tcMar>
+              <w:top w:type="dxa" w:w="60"/>
+              <w:left w:type="dxa" w:w="100"/>
+              <w:bottom w:type="dxa" w:w="60"/>
+              <w:right w:type="dxa" w:w="100"/>
+            </w:tcMar>
+          </w:tcPr>
+          <w:p>
+            <w:r>
+              <w:rPr>
+                <w:b w:val="false"/>
+                <w:bCs w:val="false"/>
+                <w:sz w:val="20"/>
+                <w:szCs w:val="20"/>
+              </w:rPr>
+              <w:t xml:space="preserve">Compras del usuario, aviso sin compras y usuario no encontrado</w:t>
+            </w:r>
+          </w:p>
+        </w:tc>
+        <w:tc>
+          <w:tcPr>
+            <w:tcW w:type="dxa" w:w="1800"/>
+            <w:tcBorders>
+              <w:top w:val="single" w:color="999999" w:sz="4"/>
+              <w:left w:val="single" w:color="999999" w:sz="4"/>
+              <w:bottom w:val="single" w:color="999999" w:sz="4"/>
+              <w:right w:val="single" w:color="999999" w:sz="4"/>
+            </w:tcBorders>
+            <w:tcMar>
+              <w:top w:type="dxa" w:w="60"/>
+              <w:left w:type="dxa" w:w="100"/>
+              <w:bottom w:type="dxa" w:w="60"/>
+              <w:right w:type="dxa" w:w="100"/>
+            </w:tcMar>
+          </w:tcPr>
+          <w:p>
+            <w:r>
+              <w:rPr>
+                <w:b w:val="false"/>
+                <w:bCs w:val="false"/>
+                <w:sz w:val="20"/>
+                <w:szCs w:val="20"/>
+              </w:rPr>
+              <w:t xml:space="preserve">Mock de localStorage</w:t>
+            </w:r>
+          </w:p>
+        </w:tc>
+      </w:tr>
+      <w:tr>
+        <w:trPr>
+          <w:tblHeader w:val="off"/>
+        </w:trPr>
+        <w:tc>
+          <w:tcPr>
+            <w:tcW w:type="dxa" w:w="2500"/>
+            <w:tcBorders>
+              <w:top w:val="single" w:color="999999" w:sz="4"/>
+              <w:left w:val="single" w:color="999999" w:sz="4"/>
+              <w:bottom w:val="single" w:color="999999" w:sz="4"/>
+              <w:right w:val="single" w:color="999999" w:sz="4"/>
+            </w:tcBorders>
+            <w:tcMar>
+              <w:top w:type="dxa" w:w="60"/>
+              <w:left w:type="dxa" w:w="100"/>
+              <w:bottom w:type="dxa" w:w="60"/>
+              <w:right w:type="dxa" w:w="100"/>
+            </w:tcMar>
+          </w:tcPr>
+          <w:p>
+            <w:r>
+              <w:rPr>
+                <w:b w:val="false"/>
+                <w:bCs w:val="false"/>
+                <w:sz w:val="20"/>
+                <w:szCs w:val="20"/>
+              </w:rPr>
+              <w:t xml:space="preserve">AdminOrdenes.spec.js</w:t>
+            </w:r>
+          </w:p>
+        </w:tc>
+        <w:tc>
+          <w:tcPr>
+            <w:tcW w:type="dxa" w:w="700"/>
+            <w:tcBorders>
+              <w:top w:val="single" w:color="999999" w:sz="4"/>
+              <w:left w:val="single" w:color="999999" w:sz="4"/>
+              <w:bottom w:val="single" w:color="999999" w:sz="4"/>
+              <w:right w:val="single" w:color="999999" w:sz="4"/>
+            </w:tcBorders>
+            <w:tcMar>
+              <w:top w:type="dxa" w:w="60"/>
+              <w:left w:type="dxa" w:w="100"/>
+              <w:bottom w:type="dxa" w:w="60"/>
+              <w:right w:type="dxa" w:w="100"/>
+            </w:tcMar>
+          </w:tcPr>
+          <w:p>
+            <w:r>
+              <w:rPr>
+                <w:b w:val="false"/>
+                <w:bCs w:val="false"/>
+                <w:sz w:val="20"/>
+                <w:szCs w:val="20"/>
+              </w:rPr>
+              <w:t xml:space="preserve">3</w:t>
+            </w:r>
+          </w:p>
+        </w:tc>
+        <w:tc>
+          <w:tcPr>
+            <w:tcW w:type="dxa" w:w="4300"/>
+            <w:tcBorders>
+              <w:top w:val="single" w:color="999999" w:sz="4"/>
+              <w:left w:val="single" w:color="999999" w:sz="4"/>
+              <w:bottom w:val="single" w:color="999999" w:sz="4"/>
+              <w:right w:val="single" w:color="999999" w:sz="4"/>
+            </w:tcBorders>
+            <w:tcMar>
+              <w:top w:type="dxa" w:w="60"/>
+              <w:left w:type="dxa" w:w="100"/>
+              <w:bottom w:type="dxa" w:w="60"/>
+              <w:right w:type="dxa" w:w="100"/>
+            </w:tcMar>
+          </w:tcPr>
+          <w:p>
+            <w:r>
+              <w:rPr>
+                <w:b w:val="false"/>
+                <w:bCs w:val="false"/>
+                <w:sz w:val="20"/>
+                <w:szCs w:val="20"/>
+              </w:rPr>
+              <w:t xml:space="preserve">Aviso sin órdenes, listado y orden más nueva primero</w:t>
+            </w:r>
+          </w:p>
+        </w:tc>
+        <w:tc>
+          <w:tcPr>
+            <w:tcW w:type="dxa" w:w="1800"/>
+            <w:tcBorders>
+              <w:top w:val="single" w:color="999999" w:sz="4"/>
+              <w:left w:val="single" w:color="999999" w:sz="4"/>
+              <w:bottom w:val="single" w:color="999999" w:sz="4"/>
+              <w:right w:val="single" w:color="999999" w:sz="4"/>
+            </w:tcBorders>
+            <w:tcMar>
+              <w:top w:type="dxa" w:w="60"/>
+              <w:left w:type="dxa" w:w="100"/>
+              <w:bottom w:type="dxa" w:w="60"/>
+              <w:right w:type="dxa" w:w="100"/>
+            </w:tcMar>
+          </w:tcPr>
+          <w:p>
+            <w:r>
+              <w:rPr>
+                <w:b w:val="false"/>
+                <w:bCs w:val="false"/>
+                <w:sz w:val="20"/>
+                <w:szCs w:val="20"/>
+              </w:rPr>
+              <w:t xml:space="preserve">Mock de localStorage</w:t>
+            </w:r>
+          </w:p>
+        </w:tc>
+      </w:tr>
+      <w:tr>
+        <w:trPr>
+          <w:tblHeader w:val="off"/>
+        </w:trPr>
+        <w:tc>
+          <w:tcPr>
+            <w:tcW w:type="dxa" w:w="2500"/>
+            <w:tcBorders>
+              <w:top w:val="single" w:color="999999" w:sz="4"/>
+              <w:left w:val="single" w:color="999999" w:sz="4"/>
+              <w:bottom w:val="single" w:color="999999" w:sz="4"/>
+              <w:right w:val="single" w:color="999999" w:sz="4"/>
+            </w:tcBorders>
+            <w:tcMar>
+              <w:top w:type="dxa" w:w="60"/>
+              <w:left w:type="dxa" w:w="100"/>
+              <w:bottom w:type="dxa" w:w="60"/>
+              <w:right w:type="dxa" w:w="100"/>
+            </w:tcMar>
+          </w:tcPr>
+          <w:p>
+            <w:r>
+              <w:rPr>
+                <w:b w:val="false"/>
+                <w:bCs w:val="false"/>
+                <w:sz w:val="20"/>
+                <w:szCs w:val="20"/>
+              </w:rPr>
+              <w:t xml:space="preserve">Boleta.spec.js</w:t>
+            </w:r>
+          </w:p>
+        </w:tc>
+        <w:tc>
+          <w:tcPr>
+            <w:tcW w:type="dxa" w:w="700"/>
+            <w:tcBorders>
+              <w:top w:val="single" w:color="999999" w:sz="4"/>
+              <w:left w:val="single" w:color="999999" w:sz="4"/>
+              <w:bottom w:val="single" w:color="999999" w:sz="4"/>
+              <w:right w:val="single" w:color="999999" w:sz="4"/>
+            </w:tcBorders>
+            <w:tcMar>
+              <w:top w:type="dxa" w:w="60"/>
+              <w:left w:type="dxa" w:w="100"/>
+              <w:bottom w:type="dxa" w:w="60"/>
+              <w:right w:type="dxa" w:w="100"/>
+            </w:tcMar>
+          </w:tcPr>
+          <w:p>
+            <w:r>
+              <w:rPr>
+                <w:b w:val="false"/>
+                <w:bCs w:val="false"/>
+                <w:sz w:val="20"/>
+                <w:szCs w:val="20"/>
+              </w:rPr>
+              <w:t xml:space="preserve">3</w:t>
+            </w:r>
+          </w:p>
+        </w:tc>
+        <w:tc>
+          <w:tcPr>
+            <w:tcW w:type="dxa" w:w="4300"/>
+            <w:tcBorders>
+              <w:top w:val="single" w:color="999999" w:sz="4"/>
+              <w:left w:val="single" w:color="999999" w:sz="4"/>
+              <w:bottom w:val="single" w:color="999999" w:sz="4"/>
+              <w:right w:val="single" w:color="999999" w:sz="4"/>
+            </w:tcBorders>
+            <w:tcMar>
+              <w:top w:type="dxa" w:w="60"/>
+              <w:left w:type="dxa" w:w="100"/>
+              <w:bottom w:type="dxa" w:w="60"/>
+              <w:right w:type="dxa" w:w="100"/>
+            </w:tcMar>
+          </w:tcPr>
+          <w:p>
+            <w:r>
+              <w:rPr>
+                <w:b w:val="false"/>
+                <w:bCs w:val="false"/>
+                <w:sz w:val="20"/>
+                <w:szCs w:val="20"/>
+              </w:rPr>
+              <w:t xml:space="preserve">Datos de la orden, botón Imprimir y orden no encontrada</w:t>
+            </w:r>
+          </w:p>
+        </w:tc>
+        <w:tc>
+          <w:tcPr>
+            <w:tcW w:type="dxa" w:w="1800"/>
+            <w:tcBorders>
+              <w:top w:val="single" w:color="999999" w:sz="4"/>
+              <w:left w:val="single" w:color="999999" w:sz="4"/>
+              <w:bottom w:val="single" w:color="999999" w:sz="4"/>
+              <w:right w:val="single" w:color="999999" w:sz="4"/>
+            </w:tcBorders>
+            <w:tcMar>
+              <w:top w:type="dxa" w:w="60"/>
+              <w:left w:type="dxa" w:w="100"/>
+              <w:bottom w:type="dxa" w:w="60"/>
+              <w:right w:type="dxa" w:w="100"/>
+            </w:tcMar>
+          </w:tcPr>
+          <w:p>
+            <w:r>
+              <w:rPr>
+                <w:b w:val="false"/>
+                <w:bCs w:val="false"/>
+                <w:sz w:val="20"/>
+                <w:szCs w:val="20"/>
+              </w:rPr>
+              <w:t xml:space="preserve">jasmine.createSpy y mock de localStorage</w:t>
             </w:r>
           </w:p>
         </w:tc>
@@ -1912,6 +2497,19 @@
       </w:pPr>
       <w:r>
         <w:t xml:space="preserve">window.confirm: se simula con spyOn(window, "confirm") para probar los dos caminos de la eliminación, cancelar y aceptar.</w:t>
+      </w:r>
+    </w:p>
+    <w:p>
+      <w:pPr>
+        <w:pStyle w:val="ListParagraph"/>
+        <w:numPr>
+          <w:ilvl w:val="0"/>
+          <w:numId w:val="2"/>
+        </w:numPr>
+        <w:spacing w:after="60"/>
+      </w:pPr>
+      <w:r>
+        <w:t xml:space="preserve">window.print: se simula con spyOn(window, "print") para comprobar que el botón Imprimir de la boleta llama a la función, sin abrir el diálogo real de impresión.</w:t>
       </w:r>
     </w:p>
     <w:p>

</xml_diff>

<commit_message>
actualiza la tabla de resultados en el documento de cobertura
</commit_message>
<xml_diff>
--- a/docs/Cobertura-Testing-IronDisk.docx
+++ b/docs/Cobertura-Testing-IronDisk.docx
@@ -2668,7 +2668,7 @@
                 <w:sz w:val="20"/>
                 <w:szCs w:val="20"/>
               </w:rPr>
-              <w:t xml:space="preserve">56</w:t>
+              <w:t xml:space="preserve">73</w:t>
             </w:r>
           </w:p>
         </w:tc>
@@ -2729,7 +2729,7 @@
                 <w:sz w:val="20"/>
                 <w:szCs w:val="20"/>
               </w:rPr>
-              <w:t xml:space="preserve">56</w:t>
+              <w:t xml:space="preserve">73</w:t>
             </w:r>
           </w:p>
         </w:tc>
@@ -2851,7 +2851,7 @@
                 <w:sz w:val="20"/>
                 <w:szCs w:val="20"/>
               </w:rPr>
-              <w:t xml:space="preserve">82.29% (251 de 305)</w:t>
+              <w:t xml:space="preserve">87.90% (356 de 405)</w:t>
             </w:r>
           </w:p>
         </w:tc>
@@ -2912,7 +2912,7 @@
                 <w:sz w:val="20"/>
                 <w:szCs w:val="20"/>
               </w:rPr>
-              <w:t xml:space="preserve">79.59% (156 de 196)</w:t>
+              <w:t xml:space="preserve">80.82% (215 de 266)</w:t>
             </w:r>
           </w:p>
         </w:tc>
@@ -2973,7 +2973,7 @@
                 <w:sz w:val="20"/>
                 <w:szCs w:val="20"/>
               </w:rPr>
-              <w:t xml:space="preserve">75.83% (91 de 120)</w:t>
+              <w:t xml:space="preserve">87.65% (142 de 162)</w:t>
             </w:r>
           </w:p>
         </w:tc>
@@ -3034,7 +3034,7 @@
                 <w:sz w:val="20"/>
                 <w:szCs w:val="20"/>
               </w:rPr>
-              <w:t xml:space="preserve">84.13% (228 de 271)</w:t>
+              <w:t xml:space="preserve">89.01% (316 de 355)</w:t>
             </w:r>
           </w:p>
         </w:tc>

</xml_diff>

<commit_message>
actualiza la cobertura por archivo en el documento de cobertura
</commit_message>
<xml_diff>
--- a/docs/Cobertura-Testing-IronDisk.docx
+++ b/docs/Cobertura-Testing-IronDisk.docx
@@ -3708,91 +3708,91 @@
                 <w:sz w:val="20"/>
                 <w:szCs w:val="20"/>
               </w:rPr>
-              <w:t xml:space="preserve">75%</w:t>
-            </w:r>
-          </w:p>
-        </w:tc>
-        <w:tc>
-          <w:tcPr>
-            <w:tcW w:type="dxa" w:w="1200"/>
-            <w:tcBorders>
-              <w:top w:val="single" w:color="999999" w:sz="4"/>
-              <w:left w:val="single" w:color="999999" w:sz="4"/>
-              <w:bottom w:val="single" w:color="999999" w:sz="4"/>
-              <w:right w:val="single" w:color="999999" w:sz="4"/>
-            </w:tcBorders>
-            <w:tcMar>
-              <w:top w:type="dxa" w:w="60"/>
-              <w:left w:type="dxa" w:w="100"/>
-              <w:bottom w:type="dxa" w:w="60"/>
-              <w:right w:type="dxa" w:w="100"/>
-            </w:tcMar>
-          </w:tcPr>
-          <w:p>
-            <w:r>
-              <w:rPr>
-                <w:b w:val="false"/>
-                <w:bCs w:val="false"/>
-                <w:sz w:val="20"/>
-                <w:szCs w:val="20"/>
-              </w:rPr>
-              <w:t xml:space="preserve">64.28%</w:t>
-            </w:r>
-          </w:p>
-        </w:tc>
-        <w:tc>
-          <w:tcPr>
-            <w:tcW w:type="dxa" w:w="1200"/>
-            <w:tcBorders>
-              <w:top w:val="single" w:color="999999" w:sz="4"/>
-              <w:left w:val="single" w:color="999999" w:sz="4"/>
-              <w:bottom w:val="single" w:color="999999" w:sz="4"/>
-              <w:right w:val="single" w:color="999999" w:sz="4"/>
-            </w:tcBorders>
-            <w:tcMar>
-              <w:top w:type="dxa" w:w="60"/>
-              <w:left w:type="dxa" w:w="100"/>
-              <w:bottom w:type="dxa" w:w="60"/>
-              <w:right w:type="dxa" w:w="100"/>
-            </w:tcMar>
-          </w:tcPr>
-          <w:p>
-            <w:r>
-              <w:rPr>
-                <w:b w:val="false"/>
-                <w:bCs w:val="false"/>
-                <w:sz w:val="20"/>
-                <w:szCs w:val="20"/>
-              </w:rPr>
-              <w:t xml:space="preserve">60%</w:t>
-            </w:r>
-          </w:p>
-        </w:tc>
-        <w:tc>
-          <w:tcPr>
-            <w:tcW w:type="dxa" w:w="1200"/>
-            <w:tcBorders>
-              <w:top w:val="single" w:color="999999" w:sz="4"/>
-              <w:left w:val="single" w:color="999999" w:sz="4"/>
-              <w:bottom w:val="single" w:color="999999" w:sz="4"/>
-              <w:right w:val="single" w:color="999999" w:sz="4"/>
-            </w:tcBorders>
-            <w:tcMar>
-              <w:top w:type="dxa" w:w="60"/>
-              <w:left w:type="dxa" w:w="100"/>
-              <w:bottom w:type="dxa" w:w="60"/>
-              <w:right w:type="dxa" w:w="100"/>
-            </w:tcMar>
-          </w:tcPr>
-          <w:p>
-            <w:r>
-              <w:rPr>
-                <w:b w:val="false"/>
-                <w:bCs w:val="false"/>
-                <w:sz w:val="20"/>
-                <w:szCs w:val="20"/>
-              </w:rPr>
-              <w:t xml:space="preserve">70%</w:t>
+              <w:t xml:space="preserve">100%</w:t>
+            </w:r>
+          </w:p>
+        </w:tc>
+        <w:tc>
+          <w:tcPr>
+            <w:tcW w:type="dxa" w:w="1200"/>
+            <w:tcBorders>
+              <w:top w:val="single" w:color="999999" w:sz="4"/>
+              <w:left w:val="single" w:color="999999" w:sz="4"/>
+              <w:bottom w:val="single" w:color="999999" w:sz="4"/>
+              <w:right w:val="single" w:color="999999" w:sz="4"/>
+            </w:tcBorders>
+            <w:tcMar>
+              <w:top w:type="dxa" w:w="60"/>
+              <w:left w:type="dxa" w:w="100"/>
+              <w:bottom w:type="dxa" w:w="60"/>
+              <w:right w:type="dxa" w:w="100"/>
+            </w:tcMar>
+          </w:tcPr>
+          <w:p>
+            <w:r>
+              <w:rPr>
+                <w:b w:val="false"/>
+                <w:bCs w:val="false"/>
+                <w:sz w:val="20"/>
+                <w:szCs w:val="20"/>
+              </w:rPr>
+              <w:t xml:space="preserve">100%</w:t>
+            </w:r>
+          </w:p>
+        </w:tc>
+        <w:tc>
+          <w:tcPr>
+            <w:tcW w:type="dxa" w:w="1200"/>
+            <w:tcBorders>
+              <w:top w:val="single" w:color="999999" w:sz="4"/>
+              <w:left w:val="single" w:color="999999" w:sz="4"/>
+              <w:bottom w:val="single" w:color="999999" w:sz="4"/>
+              <w:right w:val="single" w:color="999999" w:sz="4"/>
+            </w:tcBorders>
+            <w:tcMar>
+              <w:top w:type="dxa" w:w="60"/>
+              <w:left w:type="dxa" w:w="100"/>
+              <w:bottom w:type="dxa" w:w="60"/>
+              <w:right w:type="dxa" w:w="100"/>
+            </w:tcMar>
+          </w:tcPr>
+          <w:p>
+            <w:r>
+              <w:rPr>
+                <w:b w:val="false"/>
+                <w:bCs w:val="false"/>
+                <w:sz w:val="20"/>
+                <w:szCs w:val="20"/>
+              </w:rPr>
+              <w:t xml:space="preserve">100%</w:t>
+            </w:r>
+          </w:p>
+        </w:tc>
+        <w:tc>
+          <w:tcPr>
+            <w:tcW w:type="dxa" w:w="1200"/>
+            <w:tcBorders>
+              <w:top w:val="single" w:color="999999" w:sz="4"/>
+              <w:left w:val="single" w:color="999999" w:sz="4"/>
+              <w:bottom w:val="single" w:color="999999" w:sz="4"/>
+              <w:right w:val="single" w:color="999999" w:sz="4"/>
+            </w:tcBorders>
+            <w:tcMar>
+              <w:top w:type="dxa" w:w="60"/>
+              <w:left w:type="dxa" w:w="100"/>
+              <w:bottom w:type="dxa" w:w="60"/>
+              <w:right w:type="dxa" w:w="100"/>
+            </w:tcMar>
+          </w:tcPr>
+          <w:p>
+            <w:r>
+              <w:rPr>
+                <w:b w:val="false"/>
+                <w:bCs w:val="false"/>
+                <w:sz w:val="20"/>
+                <w:szCs w:val="20"/>
+              </w:rPr>
+              <w:t xml:space="preserve">100%</w:t>
             </w:r>
           </w:p>
         </w:tc>
@@ -4260,63 +4260,7 @@
                 <w:sz w:val="20"/>
                 <w:szCs w:val="20"/>
               </w:rPr>
-              <w:t xml:space="preserve">components/TablaProductos.js</w:t>
-            </w:r>
-          </w:p>
-        </w:tc>
-        <w:tc>
-          <w:tcPr>
-            <w:tcW w:type="dxa" w:w="1200"/>
-            <w:tcBorders>
-              <w:top w:val="single" w:color="999999" w:sz="4"/>
-              <w:left w:val="single" w:color="999999" w:sz="4"/>
-              <w:bottom w:val="single" w:color="999999" w:sz="4"/>
-              <w:right w:val="single" w:color="999999" w:sz="4"/>
-            </w:tcBorders>
-            <w:tcMar>
-              <w:top w:type="dxa" w:w="60"/>
-              <w:left w:type="dxa" w:w="100"/>
-              <w:bottom w:type="dxa" w:w="60"/>
-              <w:right w:type="dxa" w:w="100"/>
-            </w:tcMar>
-          </w:tcPr>
-          <w:p>
-            <w:r>
-              <w:rPr>
-                <w:b w:val="false"/>
-                <w:bCs w:val="false"/>
-                <w:sz w:val="20"/>
-                <w:szCs w:val="20"/>
-              </w:rPr>
-              <w:t xml:space="preserve">80%</w:t>
-            </w:r>
-          </w:p>
-        </w:tc>
-        <w:tc>
-          <w:tcPr>
-            <w:tcW w:type="dxa" w:w="1200"/>
-            <w:tcBorders>
-              <w:top w:val="single" w:color="999999" w:sz="4"/>
-              <w:left w:val="single" w:color="999999" w:sz="4"/>
-              <w:bottom w:val="single" w:color="999999" w:sz="4"/>
-              <w:right w:val="single" w:color="999999" w:sz="4"/>
-            </w:tcBorders>
-            <w:tcMar>
-              <w:top w:type="dxa" w:w="60"/>
-              <w:left w:type="dxa" w:w="100"/>
-              <w:bottom w:type="dxa" w:w="60"/>
-              <w:right w:type="dxa" w:w="100"/>
-            </w:tcMar>
-          </w:tcPr>
-          <w:p>
-            <w:r>
-              <w:rPr>
-                <w:b w:val="false"/>
-                <w:bCs w:val="false"/>
-                <w:sz w:val="20"/>
-                <w:szCs w:val="20"/>
-              </w:rPr>
-              <w:t xml:space="preserve">87.5%</w:t>
+              <w:t xml:space="preserve">components/SelectorRegionComuna.js</w:t>
             </w:r>
           </w:p>
         </w:tc>
@@ -4372,7 +4316,63 @@
                 <w:sz w:val="20"/>
                 <w:szCs w:val="20"/>
               </w:rPr>
-              <w:t xml:space="preserve">80%</w:t>
+              <w:t xml:space="preserve">100%</w:t>
+            </w:r>
+          </w:p>
+        </w:tc>
+        <w:tc>
+          <w:tcPr>
+            <w:tcW w:type="dxa" w:w="1200"/>
+            <w:tcBorders>
+              <w:top w:val="single" w:color="999999" w:sz="4"/>
+              <w:left w:val="single" w:color="999999" w:sz="4"/>
+              <w:bottom w:val="single" w:color="999999" w:sz="4"/>
+              <w:right w:val="single" w:color="999999" w:sz="4"/>
+            </w:tcBorders>
+            <w:tcMar>
+              <w:top w:type="dxa" w:w="60"/>
+              <w:left w:type="dxa" w:w="100"/>
+              <w:bottom w:type="dxa" w:w="60"/>
+              <w:right w:type="dxa" w:w="100"/>
+            </w:tcMar>
+          </w:tcPr>
+          <w:p>
+            <w:r>
+              <w:rPr>
+                <w:b w:val="false"/>
+                <w:bCs w:val="false"/>
+                <w:sz w:val="20"/>
+                <w:szCs w:val="20"/>
+              </w:rPr>
+              <w:t xml:space="preserve">100%</w:t>
+            </w:r>
+          </w:p>
+        </w:tc>
+        <w:tc>
+          <w:tcPr>
+            <w:tcW w:type="dxa" w:w="1200"/>
+            <w:tcBorders>
+              <w:top w:val="single" w:color="999999" w:sz="4"/>
+              <w:left w:val="single" w:color="999999" w:sz="4"/>
+              <w:bottom w:val="single" w:color="999999" w:sz="4"/>
+              <w:right w:val="single" w:color="999999" w:sz="4"/>
+            </w:tcBorders>
+            <w:tcMar>
+              <w:top w:type="dxa" w:w="60"/>
+              <w:left w:type="dxa" w:w="100"/>
+              <w:bottom w:type="dxa" w:w="60"/>
+              <w:right w:type="dxa" w:w="100"/>
+            </w:tcMar>
+          </w:tcPr>
+          <w:p>
+            <w:r>
+              <w:rPr>
+                <w:b w:val="false"/>
+                <w:bCs w:val="false"/>
+                <w:sz w:val="20"/>
+                <w:szCs w:val="20"/>
+              </w:rPr>
+              <w:t xml:space="preserve">100%</w:t>
             </w:r>
           </w:p>
         </w:tc>
@@ -4405,7 +4405,7 @@
                 <w:sz w:val="20"/>
                 <w:szCs w:val="20"/>
               </w:rPr>
-              <w:t xml:space="preserve">context/AuthContext.js</w:t>
+              <w:t xml:space="preserve">components/TablaProductos.js</w:t>
             </w:r>
           </w:p>
         </w:tc>
@@ -4489,35 +4489,35 @@
                 <w:sz w:val="20"/>
                 <w:szCs w:val="20"/>
               </w:rPr>
-              <w:t xml:space="preserve">71.42%</w:t>
-            </w:r>
-          </w:p>
-        </w:tc>
-        <w:tc>
-          <w:tcPr>
-            <w:tcW w:type="dxa" w:w="1200"/>
-            <w:tcBorders>
-              <w:top w:val="single" w:color="999999" w:sz="4"/>
-              <w:left w:val="single" w:color="999999" w:sz="4"/>
-              <w:bottom w:val="single" w:color="999999" w:sz="4"/>
-              <w:right w:val="single" w:color="999999" w:sz="4"/>
-            </w:tcBorders>
-            <w:tcMar>
-              <w:top w:type="dxa" w:w="60"/>
-              <w:left w:type="dxa" w:w="100"/>
-              <w:bottom w:type="dxa" w:w="60"/>
-              <w:right w:type="dxa" w:w="100"/>
-            </w:tcMar>
-          </w:tcPr>
-          <w:p>
-            <w:r>
-              <w:rPr>
-                <w:b w:val="false"/>
-                <w:bCs w:val="false"/>
-                <w:sz w:val="20"/>
-                <w:szCs w:val="20"/>
-              </w:rPr>
-              <w:t xml:space="preserve">79.16%</w:t>
+              <w:t xml:space="preserve">100%</w:t>
+            </w:r>
+          </w:p>
+        </w:tc>
+        <w:tc>
+          <w:tcPr>
+            <w:tcW w:type="dxa" w:w="1200"/>
+            <w:tcBorders>
+              <w:top w:val="single" w:color="999999" w:sz="4"/>
+              <w:left w:val="single" w:color="999999" w:sz="4"/>
+              <w:bottom w:val="single" w:color="999999" w:sz="4"/>
+              <w:right w:val="single" w:color="999999" w:sz="4"/>
+            </w:tcBorders>
+            <w:tcMar>
+              <w:top w:type="dxa" w:w="60"/>
+              <w:left w:type="dxa" w:w="100"/>
+              <w:bottom w:type="dxa" w:w="60"/>
+              <w:right w:type="dxa" w:w="100"/>
+            </w:tcMar>
+          </w:tcPr>
+          <w:p>
+            <w:r>
+              <w:rPr>
+                <w:b w:val="false"/>
+                <w:bCs w:val="false"/>
+                <w:sz w:val="20"/>
+                <w:szCs w:val="20"/>
+              </w:rPr>
+              <w:t xml:space="preserve">80%</w:t>
             </w:r>
           </w:p>
         </w:tc>
@@ -4550,119 +4550,119 @@
                 <w:sz w:val="20"/>
                 <w:szCs w:val="20"/>
               </w:rPr>
-              <w:t xml:space="preserve">context/CarritoContext.js</w:t>
-            </w:r>
-          </w:p>
-        </w:tc>
-        <w:tc>
-          <w:tcPr>
-            <w:tcW w:type="dxa" w:w="1200"/>
-            <w:tcBorders>
-              <w:top w:val="single" w:color="999999" w:sz="4"/>
-              <w:left w:val="single" w:color="999999" w:sz="4"/>
-              <w:bottom w:val="single" w:color="999999" w:sz="4"/>
-              <w:right w:val="single" w:color="999999" w:sz="4"/>
-            </w:tcBorders>
-            <w:tcMar>
-              <w:top w:type="dxa" w:w="60"/>
-              <w:left w:type="dxa" w:w="100"/>
-              <w:bottom w:type="dxa" w:w="60"/>
-              <w:right w:type="dxa" w:w="100"/>
-            </w:tcMar>
-          </w:tcPr>
-          <w:p>
-            <w:r>
-              <w:rPr>
-                <w:b w:val="false"/>
-                <w:bCs w:val="false"/>
-                <w:sz w:val="20"/>
-                <w:szCs w:val="20"/>
-              </w:rPr>
-              <w:t xml:space="preserve">83.33%</w:t>
-            </w:r>
-          </w:p>
-        </w:tc>
-        <w:tc>
-          <w:tcPr>
-            <w:tcW w:type="dxa" w:w="1200"/>
-            <w:tcBorders>
-              <w:top w:val="single" w:color="999999" w:sz="4"/>
-              <w:left w:val="single" w:color="999999" w:sz="4"/>
-              <w:bottom w:val="single" w:color="999999" w:sz="4"/>
-              <w:right w:val="single" w:color="999999" w:sz="4"/>
-            </w:tcBorders>
-            <w:tcMar>
-              <w:top w:type="dxa" w:w="60"/>
-              <w:left w:type="dxa" w:w="100"/>
-              <w:bottom w:type="dxa" w:w="60"/>
-              <w:right w:type="dxa" w:w="100"/>
-            </w:tcMar>
-          </w:tcPr>
-          <w:p>
-            <w:r>
-              <w:rPr>
-                <w:b w:val="false"/>
-                <w:bCs w:val="false"/>
-                <w:sz w:val="20"/>
-                <w:szCs w:val="20"/>
-              </w:rPr>
-              <w:t xml:space="preserve">57.14%</w:t>
-            </w:r>
-          </w:p>
-        </w:tc>
-        <w:tc>
-          <w:tcPr>
-            <w:tcW w:type="dxa" w:w="1200"/>
-            <w:tcBorders>
-              <w:top w:val="single" w:color="999999" w:sz="4"/>
-              <w:left w:val="single" w:color="999999" w:sz="4"/>
-              <w:bottom w:val="single" w:color="999999" w:sz="4"/>
-              <w:right w:val="single" w:color="999999" w:sz="4"/>
-            </w:tcBorders>
-            <w:tcMar>
-              <w:top w:type="dxa" w:w="60"/>
-              <w:left w:type="dxa" w:w="100"/>
-              <w:bottom w:type="dxa" w:w="60"/>
-              <w:right w:type="dxa" w:w="100"/>
-            </w:tcMar>
-          </w:tcPr>
-          <w:p>
-            <w:r>
-              <w:rPr>
-                <w:b w:val="false"/>
-                <w:bCs w:val="false"/>
-                <w:sz w:val="20"/>
-                <w:szCs w:val="20"/>
-              </w:rPr>
-              <w:t xml:space="preserve">77.27%</w:t>
-            </w:r>
-          </w:p>
-        </w:tc>
-        <w:tc>
-          <w:tcPr>
-            <w:tcW w:type="dxa" w:w="1200"/>
-            <w:tcBorders>
-              <w:top w:val="single" w:color="999999" w:sz="4"/>
-              <w:left w:val="single" w:color="999999" w:sz="4"/>
-              <w:bottom w:val="single" w:color="999999" w:sz="4"/>
-              <w:right w:val="single" w:color="999999" w:sz="4"/>
-            </w:tcBorders>
-            <w:tcMar>
-              <w:top w:type="dxa" w:w="60"/>
-              <w:left w:type="dxa" w:w="100"/>
-              <w:bottom w:type="dxa" w:w="60"/>
-              <w:right w:type="dxa" w:w="100"/>
-            </w:tcMar>
-          </w:tcPr>
-          <w:p>
-            <w:r>
-              <w:rPr>
-                <w:b w:val="false"/>
-                <w:bCs w:val="false"/>
-                <w:sz w:val="20"/>
-                <w:szCs w:val="20"/>
-              </w:rPr>
-              <w:t xml:space="preserve">85%</w:t>
+              <w:t xml:space="preserve">components/TablaUsuarios.js</w:t>
+            </w:r>
+          </w:p>
+        </w:tc>
+        <w:tc>
+          <w:tcPr>
+            <w:tcW w:type="dxa" w:w="1200"/>
+            <w:tcBorders>
+              <w:top w:val="single" w:color="999999" w:sz="4"/>
+              <w:left w:val="single" w:color="999999" w:sz="4"/>
+              <w:bottom w:val="single" w:color="999999" w:sz="4"/>
+              <w:right w:val="single" w:color="999999" w:sz="4"/>
+            </w:tcBorders>
+            <w:tcMar>
+              <w:top w:type="dxa" w:w="60"/>
+              <w:left w:type="dxa" w:w="100"/>
+              <w:bottom w:type="dxa" w:w="60"/>
+              <w:right w:type="dxa" w:w="100"/>
+            </w:tcMar>
+          </w:tcPr>
+          <w:p>
+            <w:r>
+              <w:rPr>
+                <w:b w:val="false"/>
+                <w:bCs w:val="false"/>
+                <w:sz w:val="20"/>
+                <w:szCs w:val="20"/>
+              </w:rPr>
+              <w:t xml:space="preserve">80%</w:t>
+            </w:r>
+          </w:p>
+        </w:tc>
+        <w:tc>
+          <w:tcPr>
+            <w:tcW w:type="dxa" w:w="1200"/>
+            <w:tcBorders>
+              <w:top w:val="single" w:color="999999" w:sz="4"/>
+              <w:left w:val="single" w:color="999999" w:sz="4"/>
+              <w:bottom w:val="single" w:color="999999" w:sz="4"/>
+              <w:right w:val="single" w:color="999999" w:sz="4"/>
+            </w:tcBorders>
+            <w:tcMar>
+              <w:top w:type="dxa" w:w="60"/>
+              <w:left w:type="dxa" w:w="100"/>
+              <w:bottom w:type="dxa" w:w="60"/>
+              <w:right w:type="dxa" w:w="100"/>
+            </w:tcMar>
+          </w:tcPr>
+          <w:p>
+            <w:r>
+              <w:rPr>
+                <w:b w:val="false"/>
+                <w:bCs w:val="false"/>
+                <w:sz w:val="20"/>
+                <w:szCs w:val="20"/>
+              </w:rPr>
+              <w:t xml:space="preserve">50%</w:t>
+            </w:r>
+          </w:p>
+        </w:tc>
+        <w:tc>
+          <w:tcPr>
+            <w:tcW w:type="dxa" w:w="1200"/>
+            <w:tcBorders>
+              <w:top w:val="single" w:color="999999" w:sz="4"/>
+              <w:left w:val="single" w:color="999999" w:sz="4"/>
+              <w:bottom w:val="single" w:color="999999" w:sz="4"/>
+              <w:right w:val="single" w:color="999999" w:sz="4"/>
+            </w:tcBorders>
+            <w:tcMar>
+              <w:top w:type="dxa" w:w="60"/>
+              <w:left w:type="dxa" w:w="100"/>
+              <w:bottom w:type="dxa" w:w="60"/>
+              <w:right w:type="dxa" w:w="100"/>
+            </w:tcMar>
+          </w:tcPr>
+          <w:p>
+            <w:r>
+              <w:rPr>
+                <w:b w:val="false"/>
+                <w:bCs w:val="false"/>
+                <w:sz w:val="20"/>
+                <w:szCs w:val="20"/>
+              </w:rPr>
+              <w:t xml:space="preserve">100%</w:t>
+            </w:r>
+          </w:p>
+        </w:tc>
+        <w:tc>
+          <w:tcPr>
+            <w:tcW w:type="dxa" w:w="1200"/>
+            <w:tcBorders>
+              <w:top w:val="single" w:color="999999" w:sz="4"/>
+              <w:left w:val="single" w:color="999999" w:sz="4"/>
+              <w:bottom w:val="single" w:color="999999" w:sz="4"/>
+              <w:right w:val="single" w:color="999999" w:sz="4"/>
+            </w:tcBorders>
+            <w:tcMar>
+              <w:top w:type="dxa" w:w="60"/>
+              <w:left w:type="dxa" w:w="100"/>
+              <w:bottom w:type="dxa" w:w="60"/>
+              <w:right w:type="dxa" w:w="100"/>
+            </w:tcMar>
+          </w:tcPr>
+          <w:p>
+            <w:r>
+              <w:rPr>
+                <w:b w:val="false"/>
+                <w:bCs w:val="false"/>
+                <w:sz w:val="20"/>
+                <w:szCs w:val="20"/>
+              </w:rPr>
+              <w:t xml:space="preserve">80%</w:t>
             </w:r>
           </w:p>
         </w:tc>
@@ -4695,119 +4695,119 @@
                 <w:sz w:val="20"/>
                 <w:szCs w:val="20"/>
               </w:rPr>
-              <w:t xml:space="preserve">data/categorias.js</w:t>
-            </w:r>
-          </w:p>
-        </w:tc>
-        <w:tc>
-          <w:tcPr>
-            <w:tcW w:type="dxa" w:w="1200"/>
-            <w:tcBorders>
-              <w:top w:val="single" w:color="999999" w:sz="4"/>
-              <w:left w:val="single" w:color="999999" w:sz="4"/>
-              <w:bottom w:val="single" w:color="999999" w:sz="4"/>
-              <w:right w:val="single" w:color="999999" w:sz="4"/>
-            </w:tcBorders>
-            <w:tcMar>
-              <w:top w:type="dxa" w:w="60"/>
-              <w:left w:type="dxa" w:w="100"/>
-              <w:bottom w:type="dxa" w:w="60"/>
-              <w:right w:type="dxa" w:w="100"/>
-            </w:tcMar>
-          </w:tcPr>
-          <w:p>
-            <w:r>
-              <w:rPr>
-                <w:b w:val="false"/>
-                <w:bCs w:val="false"/>
-                <w:sz w:val="20"/>
-                <w:szCs w:val="20"/>
-              </w:rPr>
-              <w:t xml:space="preserve">50%</w:t>
-            </w:r>
-          </w:p>
-        </w:tc>
-        <w:tc>
-          <w:tcPr>
-            <w:tcW w:type="dxa" w:w="1200"/>
-            <w:tcBorders>
-              <w:top w:val="single" w:color="999999" w:sz="4"/>
-              <w:left w:val="single" w:color="999999" w:sz="4"/>
-              <w:bottom w:val="single" w:color="999999" w:sz="4"/>
-              <w:right w:val="single" w:color="999999" w:sz="4"/>
-            </w:tcBorders>
-            <w:tcMar>
-              <w:top w:type="dxa" w:w="60"/>
-              <w:left w:type="dxa" w:w="100"/>
-              <w:bottom w:type="dxa" w:w="60"/>
-              <w:right w:type="dxa" w:w="100"/>
-            </w:tcMar>
-          </w:tcPr>
-          <w:p>
-            <w:r>
-              <w:rPr>
-                <w:b w:val="false"/>
-                <w:bCs w:val="false"/>
-                <w:sz w:val="20"/>
-                <w:szCs w:val="20"/>
-              </w:rPr>
-              <w:t xml:space="preserve">100%</w:t>
-            </w:r>
-          </w:p>
-        </w:tc>
-        <w:tc>
-          <w:tcPr>
-            <w:tcW w:type="dxa" w:w="1200"/>
-            <w:tcBorders>
-              <w:top w:val="single" w:color="999999" w:sz="4"/>
-              <w:left w:val="single" w:color="999999" w:sz="4"/>
-              <w:bottom w:val="single" w:color="999999" w:sz="4"/>
-              <w:right w:val="single" w:color="999999" w:sz="4"/>
-            </w:tcBorders>
-            <w:tcMar>
-              <w:top w:type="dxa" w:w="60"/>
-              <w:left w:type="dxa" w:w="100"/>
-              <w:bottom w:type="dxa" w:w="60"/>
-              <w:right w:type="dxa" w:w="100"/>
-            </w:tcMar>
-          </w:tcPr>
-          <w:p>
-            <w:r>
-              <w:rPr>
-                <w:b w:val="false"/>
-                <w:bCs w:val="false"/>
-                <w:sz w:val="20"/>
-                <w:szCs w:val="20"/>
-              </w:rPr>
-              <w:t xml:space="preserve">25%</w:t>
-            </w:r>
-          </w:p>
-        </w:tc>
-        <w:tc>
-          <w:tcPr>
-            <w:tcW w:type="dxa" w:w="1200"/>
-            <w:tcBorders>
-              <w:top w:val="single" w:color="999999" w:sz="4"/>
-              <w:left w:val="single" w:color="999999" w:sz="4"/>
-              <w:bottom w:val="single" w:color="999999" w:sz="4"/>
-              <w:right w:val="single" w:color="999999" w:sz="4"/>
-            </w:tcBorders>
-            <w:tcMar>
-              <w:top w:type="dxa" w:w="60"/>
-              <w:left w:type="dxa" w:w="100"/>
-              <w:bottom w:type="dxa" w:w="60"/>
-              <w:right w:type="dxa" w:w="100"/>
-            </w:tcMar>
-          </w:tcPr>
-          <w:p>
-            <w:r>
-              <w:rPr>
-                <w:b w:val="false"/>
-                <w:bCs w:val="false"/>
-                <w:sz w:val="20"/>
-                <w:szCs w:val="20"/>
-              </w:rPr>
-              <w:t xml:space="preserve">50%</w:t>
+              <w:t xml:space="preserve">context/AuthContext.js</w:t>
+            </w:r>
+          </w:p>
+        </w:tc>
+        <w:tc>
+          <w:tcPr>
+            <w:tcW w:type="dxa" w:w="1200"/>
+            <w:tcBorders>
+              <w:top w:val="single" w:color="999999" w:sz="4"/>
+              <w:left w:val="single" w:color="999999" w:sz="4"/>
+              <w:bottom w:val="single" w:color="999999" w:sz="4"/>
+              <w:right w:val="single" w:color="999999" w:sz="4"/>
+            </w:tcBorders>
+            <w:tcMar>
+              <w:top w:type="dxa" w:w="60"/>
+              <w:left w:type="dxa" w:w="100"/>
+              <w:bottom w:type="dxa" w:w="60"/>
+              <w:right w:type="dxa" w:w="100"/>
+            </w:tcMar>
+          </w:tcPr>
+          <w:p>
+            <w:r>
+              <w:rPr>
+                <w:b w:val="false"/>
+                <w:bCs w:val="false"/>
+                <w:sz w:val="20"/>
+                <w:szCs w:val="20"/>
+              </w:rPr>
+              <w:t xml:space="preserve">80%</w:t>
+            </w:r>
+          </w:p>
+        </w:tc>
+        <w:tc>
+          <w:tcPr>
+            <w:tcW w:type="dxa" w:w="1200"/>
+            <w:tcBorders>
+              <w:top w:val="single" w:color="999999" w:sz="4"/>
+              <w:left w:val="single" w:color="999999" w:sz="4"/>
+              <w:bottom w:val="single" w:color="999999" w:sz="4"/>
+              <w:right w:val="single" w:color="999999" w:sz="4"/>
+            </w:tcBorders>
+            <w:tcMar>
+              <w:top w:type="dxa" w:w="60"/>
+              <w:left w:type="dxa" w:w="100"/>
+              <w:bottom w:type="dxa" w:w="60"/>
+              <w:right w:type="dxa" w:w="100"/>
+            </w:tcMar>
+          </w:tcPr>
+          <w:p>
+            <w:r>
+              <w:rPr>
+                <w:b w:val="false"/>
+                <w:bCs w:val="false"/>
+                <w:sz w:val="20"/>
+                <w:szCs w:val="20"/>
+              </w:rPr>
+              <w:t xml:space="preserve">87.5%</w:t>
+            </w:r>
+          </w:p>
+        </w:tc>
+        <w:tc>
+          <w:tcPr>
+            <w:tcW w:type="dxa" w:w="1200"/>
+            <w:tcBorders>
+              <w:top w:val="single" w:color="999999" w:sz="4"/>
+              <w:left w:val="single" w:color="999999" w:sz="4"/>
+              <w:bottom w:val="single" w:color="999999" w:sz="4"/>
+              <w:right w:val="single" w:color="999999" w:sz="4"/>
+            </w:tcBorders>
+            <w:tcMar>
+              <w:top w:type="dxa" w:w="60"/>
+              <w:left w:type="dxa" w:w="100"/>
+              <w:bottom w:type="dxa" w:w="60"/>
+              <w:right w:type="dxa" w:w="100"/>
+            </w:tcMar>
+          </w:tcPr>
+          <w:p>
+            <w:r>
+              <w:rPr>
+                <w:b w:val="false"/>
+                <w:bCs w:val="false"/>
+                <w:sz w:val="20"/>
+                <w:szCs w:val="20"/>
+              </w:rPr>
+              <w:t xml:space="preserve">71.42%</w:t>
+            </w:r>
+          </w:p>
+        </w:tc>
+        <w:tc>
+          <w:tcPr>
+            <w:tcW w:type="dxa" w:w="1200"/>
+            <w:tcBorders>
+              <w:top w:val="single" w:color="999999" w:sz="4"/>
+              <w:left w:val="single" w:color="999999" w:sz="4"/>
+              <w:bottom w:val="single" w:color="999999" w:sz="4"/>
+              <w:right w:val="single" w:color="999999" w:sz="4"/>
+            </w:tcBorders>
+            <w:tcMar>
+              <w:top w:type="dxa" w:w="60"/>
+              <w:left w:type="dxa" w:w="100"/>
+              <w:bottom w:type="dxa" w:w="60"/>
+              <w:right w:type="dxa" w:w="100"/>
+            </w:tcMar>
+          </w:tcPr>
+          <w:p>
+            <w:r>
+              <w:rPr>
+                <w:b w:val="false"/>
+                <w:bCs w:val="false"/>
+                <w:sz w:val="20"/>
+                <w:szCs w:val="20"/>
+              </w:rPr>
+              <w:t xml:space="preserve">79.16%</w:t>
             </w:r>
           </w:p>
         </w:tc>
@@ -4840,119 +4840,119 @@
                 <w:sz w:val="20"/>
                 <w:szCs w:val="20"/>
               </w:rPr>
-              <w:t xml:space="preserve">data/productos.js</w:t>
-            </w:r>
-          </w:p>
-        </w:tc>
-        <w:tc>
-          <w:tcPr>
-            <w:tcW w:type="dxa" w:w="1200"/>
-            <w:tcBorders>
-              <w:top w:val="single" w:color="999999" w:sz="4"/>
-              <w:left w:val="single" w:color="999999" w:sz="4"/>
-              <w:bottom w:val="single" w:color="999999" w:sz="4"/>
-              <w:right w:val="single" w:color="999999" w:sz="4"/>
-            </w:tcBorders>
-            <w:tcMar>
-              <w:top w:type="dxa" w:w="60"/>
-              <w:left w:type="dxa" w:w="100"/>
-              <w:bottom w:type="dxa" w:w="60"/>
-              <w:right w:type="dxa" w:w="100"/>
-            </w:tcMar>
-          </w:tcPr>
-          <w:p>
-            <w:r>
-              <w:rPr>
-                <w:b w:val="false"/>
-                <w:bCs w:val="false"/>
-                <w:sz w:val="20"/>
-                <w:szCs w:val="20"/>
-              </w:rPr>
-              <w:t xml:space="preserve">87.5%</w:t>
-            </w:r>
-          </w:p>
-        </w:tc>
-        <w:tc>
-          <w:tcPr>
-            <w:tcW w:type="dxa" w:w="1200"/>
-            <w:tcBorders>
-              <w:top w:val="single" w:color="999999" w:sz="4"/>
-              <w:left w:val="single" w:color="999999" w:sz="4"/>
-              <w:bottom w:val="single" w:color="999999" w:sz="4"/>
-              <w:right w:val="single" w:color="999999" w:sz="4"/>
-            </w:tcBorders>
-            <w:tcMar>
-              <w:top w:type="dxa" w:w="60"/>
-              <w:left w:type="dxa" w:w="100"/>
-              <w:bottom w:type="dxa" w:w="60"/>
-              <w:right w:type="dxa" w:w="100"/>
-            </w:tcMar>
-          </w:tcPr>
-          <w:p>
-            <w:r>
-              <w:rPr>
-                <w:b w:val="false"/>
-                <w:bCs w:val="false"/>
-                <w:sz w:val="20"/>
-                <w:szCs w:val="20"/>
-              </w:rPr>
-              <w:t xml:space="preserve">100%</w:t>
-            </w:r>
-          </w:p>
-        </w:tc>
-        <w:tc>
-          <w:tcPr>
-            <w:tcW w:type="dxa" w:w="1200"/>
-            <w:tcBorders>
-              <w:top w:val="single" w:color="999999" w:sz="4"/>
-              <w:left w:val="single" w:color="999999" w:sz="4"/>
-              <w:bottom w:val="single" w:color="999999" w:sz="4"/>
-              <w:right w:val="single" w:color="999999" w:sz="4"/>
-            </w:tcBorders>
-            <w:tcMar>
-              <w:top w:type="dxa" w:w="60"/>
-              <w:left w:type="dxa" w:w="100"/>
-              <w:bottom w:type="dxa" w:w="60"/>
-              <w:right w:type="dxa" w:w="100"/>
-            </w:tcMar>
-          </w:tcPr>
-          <w:p>
-            <w:r>
-              <w:rPr>
-                <w:b w:val="false"/>
-                <w:bCs w:val="false"/>
-                <w:sz w:val="20"/>
-                <w:szCs w:val="20"/>
-              </w:rPr>
-              <w:t xml:space="preserve">84.61%</w:t>
-            </w:r>
-          </w:p>
-        </w:tc>
-        <w:tc>
-          <w:tcPr>
-            <w:tcW w:type="dxa" w:w="1200"/>
-            <w:tcBorders>
-              <w:top w:val="single" w:color="999999" w:sz="4"/>
-              <w:left w:val="single" w:color="999999" w:sz="4"/>
-              <w:bottom w:val="single" w:color="999999" w:sz="4"/>
-              <w:right w:val="single" w:color="999999" w:sz="4"/>
-            </w:tcBorders>
-            <w:tcMar>
-              <w:top w:type="dxa" w:w="60"/>
-              <w:left w:type="dxa" w:w="100"/>
-              <w:bottom w:type="dxa" w:w="60"/>
-              <w:right w:type="dxa" w:w="100"/>
-            </w:tcMar>
-          </w:tcPr>
-          <w:p>
-            <w:r>
-              <w:rPr>
-                <w:b w:val="false"/>
-                <w:bCs w:val="false"/>
-                <w:sz w:val="20"/>
-                <w:szCs w:val="20"/>
-              </w:rPr>
-              <w:t xml:space="preserve">92.85%</w:t>
+              <w:t xml:space="preserve">context/CarritoContext.js</w:t>
+            </w:r>
+          </w:p>
+        </w:tc>
+        <w:tc>
+          <w:tcPr>
+            <w:tcW w:type="dxa" w:w="1200"/>
+            <w:tcBorders>
+              <w:top w:val="single" w:color="999999" w:sz="4"/>
+              <w:left w:val="single" w:color="999999" w:sz="4"/>
+              <w:bottom w:val="single" w:color="999999" w:sz="4"/>
+              <w:right w:val="single" w:color="999999" w:sz="4"/>
+            </w:tcBorders>
+            <w:tcMar>
+              <w:top w:type="dxa" w:w="60"/>
+              <w:left w:type="dxa" w:w="100"/>
+              <w:bottom w:type="dxa" w:w="60"/>
+              <w:right w:type="dxa" w:w="100"/>
+            </w:tcMar>
+          </w:tcPr>
+          <w:p>
+            <w:r>
+              <w:rPr>
+                <w:b w:val="false"/>
+                <w:bCs w:val="false"/>
+                <w:sz w:val="20"/>
+                <w:szCs w:val="20"/>
+              </w:rPr>
+              <w:t xml:space="preserve">83.33%</w:t>
+            </w:r>
+          </w:p>
+        </w:tc>
+        <w:tc>
+          <w:tcPr>
+            <w:tcW w:type="dxa" w:w="1200"/>
+            <w:tcBorders>
+              <w:top w:val="single" w:color="999999" w:sz="4"/>
+              <w:left w:val="single" w:color="999999" w:sz="4"/>
+              <w:bottom w:val="single" w:color="999999" w:sz="4"/>
+              <w:right w:val="single" w:color="999999" w:sz="4"/>
+            </w:tcBorders>
+            <w:tcMar>
+              <w:top w:type="dxa" w:w="60"/>
+              <w:left w:type="dxa" w:w="100"/>
+              <w:bottom w:type="dxa" w:w="60"/>
+              <w:right w:type="dxa" w:w="100"/>
+            </w:tcMar>
+          </w:tcPr>
+          <w:p>
+            <w:r>
+              <w:rPr>
+                <w:b w:val="false"/>
+                <w:bCs w:val="false"/>
+                <w:sz w:val="20"/>
+                <w:szCs w:val="20"/>
+              </w:rPr>
+              <w:t xml:space="preserve">57.14%</w:t>
+            </w:r>
+          </w:p>
+        </w:tc>
+        <w:tc>
+          <w:tcPr>
+            <w:tcW w:type="dxa" w:w="1200"/>
+            <w:tcBorders>
+              <w:top w:val="single" w:color="999999" w:sz="4"/>
+              <w:left w:val="single" w:color="999999" w:sz="4"/>
+              <w:bottom w:val="single" w:color="999999" w:sz="4"/>
+              <w:right w:val="single" w:color="999999" w:sz="4"/>
+            </w:tcBorders>
+            <w:tcMar>
+              <w:top w:type="dxa" w:w="60"/>
+              <w:left w:type="dxa" w:w="100"/>
+              <w:bottom w:type="dxa" w:w="60"/>
+              <w:right w:type="dxa" w:w="100"/>
+            </w:tcMar>
+          </w:tcPr>
+          <w:p>
+            <w:r>
+              <w:rPr>
+                <w:b w:val="false"/>
+                <w:bCs w:val="false"/>
+                <w:sz w:val="20"/>
+                <w:szCs w:val="20"/>
+              </w:rPr>
+              <w:t xml:space="preserve">77.27%</w:t>
+            </w:r>
+          </w:p>
+        </w:tc>
+        <w:tc>
+          <w:tcPr>
+            <w:tcW w:type="dxa" w:w="1200"/>
+            <w:tcBorders>
+              <w:top w:val="single" w:color="999999" w:sz="4"/>
+              <w:left w:val="single" w:color="999999" w:sz="4"/>
+              <w:bottom w:val="single" w:color="999999" w:sz="4"/>
+              <w:right w:val="single" w:color="999999" w:sz="4"/>
+            </w:tcBorders>
+            <w:tcMar>
+              <w:top w:type="dxa" w:w="60"/>
+              <w:left w:type="dxa" w:w="100"/>
+              <w:bottom w:type="dxa" w:w="60"/>
+              <w:right w:type="dxa" w:w="100"/>
+            </w:tcMar>
+          </w:tcPr>
+          <w:p>
+            <w:r>
+              <w:rPr>
+                <w:b w:val="false"/>
+                <w:bCs w:val="false"/>
+                <w:sz w:val="20"/>
+                <w:szCs w:val="20"/>
+              </w:rPr>
+              <w:t xml:space="preserve">85%</w:t>
             </w:r>
           </w:p>
         </w:tc>
@@ -4985,35 +4985,35 @@
                 <w:sz w:val="20"/>
                 <w:szCs w:val="20"/>
               </w:rPr>
-              <w:t xml:space="preserve">data/storage.js</w:t>
-            </w:r>
-          </w:p>
-        </w:tc>
-        <w:tc>
-          <w:tcPr>
-            <w:tcW w:type="dxa" w:w="1200"/>
-            <w:tcBorders>
-              <w:top w:val="single" w:color="999999" w:sz="4"/>
-              <w:left w:val="single" w:color="999999" w:sz="4"/>
-              <w:bottom w:val="single" w:color="999999" w:sz="4"/>
-              <w:right w:val="single" w:color="999999" w:sz="4"/>
-            </w:tcBorders>
-            <w:tcMar>
-              <w:top w:type="dxa" w:w="60"/>
-              <w:left w:type="dxa" w:w="100"/>
-              <w:bottom w:type="dxa" w:w="60"/>
-              <w:right w:type="dxa" w:w="100"/>
-            </w:tcMar>
-          </w:tcPr>
-          <w:p>
-            <w:r>
-              <w:rPr>
-                <w:b w:val="false"/>
-                <w:bCs w:val="false"/>
-                <w:sz w:val="20"/>
-                <w:szCs w:val="20"/>
-              </w:rPr>
-              <w:t xml:space="preserve">85.71%</w:t>
+              <w:t xml:space="preserve">data/categorias.js</w:t>
+            </w:r>
+          </w:p>
+        </w:tc>
+        <w:tc>
+          <w:tcPr>
+            <w:tcW w:type="dxa" w:w="1200"/>
+            <w:tcBorders>
+              <w:top w:val="single" w:color="999999" w:sz="4"/>
+              <w:left w:val="single" w:color="999999" w:sz="4"/>
+              <w:bottom w:val="single" w:color="999999" w:sz="4"/>
+              <w:right w:val="single" w:color="999999" w:sz="4"/>
+            </w:tcBorders>
+            <w:tcMar>
+              <w:top w:type="dxa" w:w="60"/>
+              <w:left w:type="dxa" w:w="100"/>
+              <w:bottom w:type="dxa" w:w="60"/>
+              <w:right w:type="dxa" w:w="100"/>
+            </w:tcMar>
+          </w:tcPr>
+          <w:p>
+            <w:r>
+              <w:rPr>
+                <w:b w:val="false"/>
+                <w:bCs w:val="false"/>
+                <w:sz w:val="20"/>
+                <w:szCs w:val="20"/>
+              </w:rPr>
+              <w:t xml:space="preserve">50%</w:t>
             </w:r>
           </w:p>
         </w:tc>
@@ -5069,35 +5069,35 @@
                 <w:sz w:val="20"/>
                 <w:szCs w:val="20"/>
               </w:rPr>
-              <w:t xml:space="preserve">66.66%</w:t>
-            </w:r>
-          </w:p>
-        </w:tc>
-        <w:tc>
-          <w:tcPr>
-            <w:tcW w:type="dxa" w:w="1200"/>
-            <w:tcBorders>
-              <w:top w:val="single" w:color="999999" w:sz="4"/>
-              <w:left w:val="single" w:color="999999" w:sz="4"/>
-              <w:bottom w:val="single" w:color="999999" w:sz="4"/>
-              <w:right w:val="single" w:color="999999" w:sz="4"/>
-            </w:tcBorders>
-            <w:tcMar>
-              <w:top w:type="dxa" w:w="60"/>
-              <w:left w:type="dxa" w:w="100"/>
-              <w:bottom w:type="dxa" w:w="60"/>
-              <w:right w:type="dxa" w:w="100"/>
-            </w:tcMar>
-          </w:tcPr>
-          <w:p>
-            <w:r>
-              <w:rPr>
-                <w:b w:val="false"/>
-                <w:bCs w:val="false"/>
-                <w:sz w:val="20"/>
-                <w:szCs w:val="20"/>
-              </w:rPr>
-              <w:t xml:space="preserve">85.71%</w:t>
+              <w:t xml:space="preserve">25%</w:t>
+            </w:r>
+          </w:p>
+        </w:tc>
+        <w:tc>
+          <w:tcPr>
+            <w:tcW w:type="dxa" w:w="1200"/>
+            <w:tcBorders>
+              <w:top w:val="single" w:color="999999" w:sz="4"/>
+              <w:left w:val="single" w:color="999999" w:sz="4"/>
+              <w:bottom w:val="single" w:color="999999" w:sz="4"/>
+              <w:right w:val="single" w:color="999999" w:sz="4"/>
+            </w:tcBorders>
+            <w:tcMar>
+              <w:top w:type="dxa" w:w="60"/>
+              <w:left w:type="dxa" w:w="100"/>
+              <w:bottom w:type="dxa" w:w="60"/>
+              <w:right w:type="dxa" w:w="100"/>
+            </w:tcMar>
+          </w:tcPr>
+          <w:p>
+            <w:r>
+              <w:rPr>
+                <w:b w:val="false"/>
+                <w:bCs w:val="false"/>
+                <w:sz w:val="20"/>
+                <w:szCs w:val="20"/>
+              </w:rPr>
+              <w:t xml:space="preserve">50%</w:t>
             </w:r>
           </w:p>
         </w:tc>
@@ -5130,35 +5130,35 @@
                 <w:sz w:val="20"/>
                 <w:szCs w:val="20"/>
               </w:rPr>
-              <w:t xml:space="preserve">data/usuarios.js</w:t>
-            </w:r>
-          </w:p>
-        </w:tc>
-        <w:tc>
-          <w:tcPr>
-            <w:tcW w:type="dxa" w:w="1200"/>
-            <w:tcBorders>
-              <w:top w:val="single" w:color="999999" w:sz="4"/>
-              <w:left w:val="single" w:color="999999" w:sz="4"/>
-              <w:bottom w:val="single" w:color="999999" w:sz="4"/>
-              <w:right w:val="single" w:color="999999" w:sz="4"/>
-            </w:tcBorders>
-            <w:tcMar>
-              <w:top w:type="dxa" w:w="60"/>
-              <w:left w:type="dxa" w:w="100"/>
-              <w:bottom w:type="dxa" w:w="60"/>
-              <w:right w:type="dxa" w:w="100"/>
-            </w:tcMar>
-          </w:tcPr>
-          <w:p>
-            <w:r>
-              <w:rPr>
-                <w:b w:val="false"/>
-                <w:bCs w:val="false"/>
-                <w:sz w:val="20"/>
-                <w:szCs w:val="20"/>
-              </w:rPr>
-              <w:t xml:space="preserve">46.15%</w:t>
+              <w:t xml:space="preserve">data/ordenes.js</w:t>
+            </w:r>
+          </w:p>
+        </w:tc>
+        <w:tc>
+          <w:tcPr>
+            <w:tcW w:type="dxa" w:w="1200"/>
+            <w:tcBorders>
+              <w:top w:val="single" w:color="999999" w:sz="4"/>
+              <w:left w:val="single" w:color="999999" w:sz="4"/>
+              <w:bottom w:val="single" w:color="999999" w:sz="4"/>
+              <w:right w:val="single" w:color="999999" w:sz="4"/>
+            </w:tcBorders>
+            <w:tcMar>
+              <w:top w:type="dxa" w:w="60"/>
+              <w:left w:type="dxa" w:w="100"/>
+              <w:bottom w:type="dxa" w:w="60"/>
+              <w:right w:type="dxa" w:w="100"/>
+            </w:tcMar>
+          </w:tcPr>
+          <w:p>
+            <w:r>
+              <w:rPr>
+                <w:b w:val="false"/>
+                <w:bCs w:val="false"/>
+                <w:sz w:val="20"/>
+                <w:szCs w:val="20"/>
+              </w:rPr>
+              <w:t xml:space="preserve">60%</w:t>
             </w:r>
           </w:p>
         </w:tc>
@@ -5214,35 +5214,35 @@
                 <w:sz w:val="20"/>
                 <w:szCs w:val="20"/>
               </w:rPr>
-              <w:t xml:space="preserve">30%</w:t>
-            </w:r>
-          </w:p>
-        </w:tc>
-        <w:tc>
-          <w:tcPr>
-            <w:tcW w:type="dxa" w:w="1200"/>
-            <w:tcBorders>
-              <w:top w:val="single" w:color="999999" w:sz="4"/>
-              <w:left w:val="single" w:color="999999" w:sz="4"/>
-              <w:bottom w:val="single" w:color="999999" w:sz="4"/>
-              <w:right w:val="single" w:color="999999" w:sz="4"/>
-            </w:tcBorders>
-            <w:tcMar>
-              <w:top w:type="dxa" w:w="60"/>
-              <w:left w:type="dxa" w:w="100"/>
-              <w:bottom w:type="dxa" w:w="60"/>
-              <w:right w:type="dxa" w:w="100"/>
-            </w:tcMar>
-          </w:tcPr>
-          <w:p>
-            <w:r>
-              <w:rPr>
-                <w:b w:val="false"/>
-                <w:bCs w:val="false"/>
-                <w:sz w:val="20"/>
-                <w:szCs w:val="20"/>
-              </w:rPr>
-              <w:t xml:space="preserve">45.45%</w:t>
+              <w:t xml:space="preserve">83.33%</w:t>
+            </w:r>
+          </w:p>
+        </w:tc>
+        <w:tc>
+          <w:tcPr>
+            <w:tcW w:type="dxa" w:w="1200"/>
+            <w:tcBorders>
+              <w:top w:val="single" w:color="999999" w:sz="4"/>
+              <w:left w:val="single" w:color="999999" w:sz="4"/>
+              <w:bottom w:val="single" w:color="999999" w:sz="4"/>
+              <w:right w:val="single" w:color="999999" w:sz="4"/>
+            </w:tcBorders>
+            <w:tcMar>
+              <w:top w:type="dxa" w:w="60"/>
+              <w:left w:type="dxa" w:w="100"/>
+              <w:bottom w:type="dxa" w:w="60"/>
+              <w:right w:type="dxa" w:w="100"/>
+            </w:tcMar>
+          </w:tcPr>
+          <w:p>
+            <w:r>
+              <w:rPr>
+                <w:b w:val="false"/>
+                <w:bCs w:val="false"/>
+                <w:sz w:val="20"/>
+                <w:szCs w:val="20"/>
+              </w:rPr>
+              <w:t xml:space="preserve">50%</w:t>
             </w:r>
           </w:p>
         </w:tc>
@@ -5275,7 +5275,7 @@
                 <w:sz w:val="20"/>
                 <w:szCs w:val="20"/>
               </w:rPr>
-              <w:t xml:space="preserve">hooks/useAgregarAlCarrito.js</w:t>
+              <w:t xml:space="preserve">data/productos.js</w:t>
             </w:r>
           </w:p>
         </w:tc>
@@ -5359,35 +5359,35 @@
                 <w:sz w:val="20"/>
                 <w:szCs w:val="20"/>
               </w:rPr>
-              <w:t xml:space="preserve">66.66%</w:t>
-            </w:r>
-          </w:p>
-        </w:tc>
-        <w:tc>
-          <w:tcPr>
-            <w:tcW w:type="dxa" w:w="1200"/>
-            <w:tcBorders>
-              <w:top w:val="single" w:color="999999" w:sz="4"/>
-              <w:left w:val="single" w:color="999999" w:sz="4"/>
-              <w:bottom w:val="single" w:color="999999" w:sz="4"/>
-              <w:right w:val="single" w:color="999999" w:sz="4"/>
-            </w:tcBorders>
-            <w:tcMar>
-              <w:top w:type="dxa" w:w="60"/>
-              <w:left w:type="dxa" w:w="100"/>
-              <w:bottom w:type="dxa" w:w="60"/>
-              <w:right w:type="dxa" w:w="100"/>
-            </w:tcMar>
-          </w:tcPr>
-          <w:p>
-            <w:r>
-              <w:rPr>
-                <w:b w:val="false"/>
-                <w:bCs w:val="false"/>
-                <w:sz w:val="20"/>
-                <w:szCs w:val="20"/>
-              </w:rPr>
-              <w:t xml:space="preserve">100%</w:t>
+              <w:t xml:space="preserve">84.61%</w:t>
+            </w:r>
+          </w:p>
+        </w:tc>
+        <w:tc>
+          <w:tcPr>
+            <w:tcW w:type="dxa" w:w="1200"/>
+            <w:tcBorders>
+              <w:top w:val="single" w:color="999999" w:sz="4"/>
+              <w:left w:val="single" w:color="999999" w:sz="4"/>
+              <w:bottom w:val="single" w:color="999999" w:sz="4"/>
+              <w:right w:val="single" w:color="999999" w:sz="4"/>
+            </w:tcBorders>
+            <w:tcMar>
+              <w:top w:type="dxa" w:w="60"/>
+              <w:left w:type="dxa" w:w="100"/>
+              <w:bottom w:type="dxa" w:w="60"/>
+              <w:right w:type="dxa" w:w="100"/>
+            </w:tcMar>
+          </w:tcPr>
+          <w:p>
+            <w:r>
+              <w:rPr>
+                <w:b w:val="false"/>
+                <w:bCs w:val="false"/>
+                <w:sz w:val="20"/>
+                <w:szCs w:val="20"/>
+              </w:rPr>
+              <w:t xml:space="preserve">92.85%</w:t>
             </w:r>
           </w:p>
         </w:tc>
@@ -5420,7 +5420,7 @@
                 <w:sz w:val="20"/>
                 <w:szCs w:val="20"/>
               </w:rPr>
-              <w:t xml:space="preserve">pages/Contacto.js</w:t>
+              <w:t xml:space="preserve">data/regiones.js</w:t>
             </w:r>
           </w:p>
         </w:tc>
@@ -5565,7 +5565,35 @@
                 <w:sz w:val="20"/>
                 <w:szCs w:val="20"/>
               </w:rPr>
-              <w:t xml:space="preserve">pages/Login.js</w:t>
+              <w:t xml:space="preserve">data/storage.js</w:t>
+            </w:r>
+          </w:p>
+        </w:tc>
+        <w:tc>
+          <w:tcPr>
+            <w:tcW w:type="dxa" w:w="1200"/>
+            <w:tcBorders>
+              <w:top w:val="single" w:color="999999" w:sz="4"/>
+              <w:left w:val="single" w:color="999999" w:sz="4"/>
+              <w:bottom w:val="single" w:color="999999" w:sz="4"/>
+              <w:right w:val="single" w:color="999999" w:sz="4"/>
+            </w:tcBorders>
+            <w:tcMar>
+              <w:top w:type="dxa" w:w="60"/>
+              <w:left w:type="dxa" w:w="100"/>
+              <w:bottom w:type="dxa" w:w="60"/>
+              <w:right w:type="dxa" w:w="100"/>
+            </w:tcMar>
+          </w:tcPr>
+          <w:p>
+            <w:r>
+              <w:rPr>
+                <w:b w:val="false"/>
+                <w:bCs w:val="false"/>
+                <w:sz w:val="20"/>
+                <w:szCs w:val="20"/>
+              </w:rPr>
+              <w:t xml:space="preserve">85.71%</w:t>
             </w:r>
           </w:p>
         </w:tc>
@@ -5621,63 +5649,35 @@
                 <w:sz w:val="20"/>
                 <w:szCs w:val="20"/>
               </w:rPr>
-              <w:t xml:space="preserve">91.66%</w:t>
-            </w:r>
-          </w:p>
-        </w:tc>
-        <w:tc>
-          <w:tcPr>
-            <w:tcW w:type="dxa" w:w="1200"/>
-            <w:tcBorders>
-              <w:top w:val="single" w:color="999999" w:sz="4"/>
-              <w:left w:val="single" w:color="999999" w:sz="4"/>
-              <w:bottom w:val="single" w:color="999999" w:sz="4"/>
-              <w:right w:val="single" w:color="999999" w:sz="4"/>
-            </w:tcBorders>
-            <w:tcMar>
-              <w:top w:type="dxa" w:w="60"/>
-              <w:left w:type="dxa" w:w="100"/>
-              <w:bottom w:type="dxa" w:w="60"/>
-              <w:right w:type="dxa" w:w="100"/>
-            </w:tcMar>
-          </w:tcPr>
-          <w:p>
-            <w:r>
-              <w:rPr>
-                <w:b w:val="false"/>
-                <w:bCs w:val="false"/>
-                <w:sz w:val="20"/>
-                <w:szCs w:val="20"/>
-              </w:rPr>
-              <w:t xml:space="preserve">100%</w:t>
-            </w:r>
-          </w:p>
-        </w:tc>
-        <w:tc>
-          <w:tcPr>
-            <w:tcW w:type="dxa" w:w="1200"/>
-            <w:tcBorders>
-              <w:top w:val="single" w:color="999999" w:sz="4"/>
-              <w:left w:val="single" w:color="999999" w:sz="4"/>
-              <w:bottom w:val="single" w:color="999999" w:sz="4"/>
-              <w:right w:val="single" w:color="999999" w:sz="4"/>
-            </w:tcBorders>
-            <w:tcMar>
-              <w:top w:type="dxa" w:w="60"/>
-              <w:left w:type="dxa" w:w="100"/>
-              <w:bottom w:type="dxa" w:w="60"/>
-              <w:right w:type="dxa" w:w="100"/>
-            </w:tcMar>
-          </w:tcPr>
-          <w:p>
-            <w:r>
-              <w:rPr>
-                <w:b w:val="false"/>
-                <w:bCs w:val="false"/>
-                <w:sz w:val="20"/>
-                <w:szCs w:val="20"/>
-              </w:rPr>
-              <w:t xml:space="preserve">100%</w:t>
+              <w:t xml:space="preserve">66.66%</w:t>
+            </w:r>
+          </w:p>
+        </w:tc>
+        <w:tc>
+          <w:tcPr>
+            <w:tcW w:type="dxa" w:w="1200"/>
+            <w:tcBorders>
+              <w:top w:val="single" w:color="999999" w:sz="4"/>
+              <w:left w:val="single" w:color="999999" w:sz="4"/>
+              <w:bottom w:val="single" w:color="999999" w:sz="4"/>
+              <w:right w:val="single" w:color="999999" w:sz="4"/>
+            </w:tcBorders>
+            <w:tcMar>
+              <w:top w:type="dxa" w:w="60"/>
+              <w:left w:type="dxa" w:w="100"/>
+              <w:bottom w:type="dxa" w:w="60"/>
+              <w:right w:type="dxa" w:w="100"/>
+            </w:tcMar>
+          </w:tcPr>
+          <w:p>
+            <w:r>
+              <w:rPr>
+                <w:b w:val="false"/>
+                <w:bCs w:val="false"/>
+                <w:sz w:val="20"/>
+                <w:szCs w:val="20"/>
+              </w:rPr>
+              <w:t xml:space="preserve">85.71%</w:t>
             </w:r>
           </w:p>
         </w:tc>
@@ -5710,63 +5710,63 @@
                 <w:sz w:val="20"/>
                 <w:szCs w:val="20"/>
               </w:rPr>
-              <w:t xml:space="preserve">pages/Productos.js</w:t>
-            </w:r>
-          </w:p>
-        </w:tc>
-        <w:tc>
-          <w:tcPr>
-            <w:tcW w:type="dxa" w:w="1200"/>
-            <w:tcBorders>
-              <w:top w:val="single" w:color="999999" w:sz="4"/>
-              <w:left w:val="single" w:color="999999" w:sz="4"/>
-              <w:bottom w:val="single" w:color="999999" w:sz="4"/>
-              <w:right w:val="single" w:color="999999" w:sz="4"/>
-            </w:tcBorders>
-            <w:tcMar>
-              <w:top w:type="dxa" w:w="60"/>
-              <w:left w:type="dxa" w:w="100"/>
-              <w:bottom w:type="dxa" w:w="60"/>
-              <w:right w:type="dxa" w:w="100"/>
-            </w:tcMar>
-          </w:tcPr>
-          <w:p>
-            <w:r>
-              <w:rPr>
-                <w:b w:val="false"/>
-                <w:bCs w:val="false"/>
-                <w:sz w:val="20"/>
-                <w:szCs w:val="20"/>
-              </w:rPr>
-              <w:t xml:space="preserve">92.85%</w:t>
-            </w:r>
-          </w:p>
-        </w:tc>
-        <w:tc>
-          <w:tcPr>
-            <w:tcW w:type="dxa" w:w="1200"/>
-            <w:tcBorders>
-              <w:top w:val="single" w:color="999999" w:sz="4"/>
-              <w:left w:val="single" w:color="999999" w:sz="4"/>
-              <w:bottom w:val="single" w:color="999999" w:sz="4"/>
-              <w:right w:val="single" w:color="999999" w:sz="4"/>
-            </w:tcBorders>
-            <w:tcMar>
-              <w:top w:type="dxa" w:w="60"/>
-              <w:left w:type="dxa" w:w="100"/>
-              <w:bottom w:type="dxa" w:w="60"/>
-              <w:right w:type="dxa" w:w="100"/>
-            </w:tcMar>
-          </w:tcPr>
-          <w:p>
-            <w:r>
-              <w:rPr>
-                <w:b w:val="false"/>
-                <w:bCs w:val="false"/>
-                <w:sz w:val="20"/>
-                <w:szCs w:val="20"/>
-              </w:rPr>
-              <w:t xml:space="preserve">100%</w:t>
+              <w:t xml:space="preserve">data/usuarios.js</w:t>
+            </w:r>
+          </w:p>
+        </w:tc>
+        <w:tc>
+          <w:tcPr>
+            <w:tcW w:type="dxa" w:w="1200"/>
+            <w:tcBorders>
+              <w:top w:val="single" w:color="999999" w:sz="4"/>
+              <w:left w:val="single" w:color="999999" w:sz="4"/>
+              <w:bottom w:val="single" w:color="999999" w:sz="4"/>
+              <w:right w:val="single" w:color="999999" w:sz="4"/>
+            </w:tcBorders>
+            <w:tcMar>
+              <w:top w:type="dxa" w:w="60"/>
+              <w:left w:type="dxa" w:w="100"/>
+              <w:bottom w:type="dxa" w:w="60"/>
+              <w:right w:type="dxa" w:w="100"/>
+            </w:tcMar>
+          </w:tcPr>
+          <w:p>
+            <w:r>
+              <w:rPr>
+                <w:b w:val="false"/>
+                <w:bCs w:val="false"/>
+                <w:sz w:val="20"/>
+                <w:szCs w:val="20"/>
+              </w:rPr>
+              <w:t xml:space="preserve">84.61%</w:t>
+            </w:r>
+          </w:p>
+        </w:tc>
+        <w:tc>
+          <w:tcPr>
+            <w:tcW w:type="dxa" w:w="1200"/>
+            <w:tcBorders>
+              <w:top w:val="single" w:color="999999" w:sz="4"/>
+              <w:left w:val="single" w:color="999999" w:sz="4"/>
+              <w:bottom w:val="single" w:color="999999" w:sz="4"/>
+              <w:right w:val="single" w:color="999999" w:sz="4"/>
+            </w:tcBorders>
+            <w:tcMar>
+              <w:top w:type="dxa" w:w="60"/>
+              <w:left w:type="dxa" w:w="100"/>
+              <w:bottom w:type="dxa" w:w="60"/>
+              <w:right w:type="dxa" w:w="100"/>
+            </w:tcMar>
+          </w:tcPr>
+          <w:p>
+            <w:r>
+              <w:rPr>
+                <w:b w:val="false"/>
+                <w:bCs w:val="false"/>
+                <w:sz w:val="20"/>
+                <w:szCs w:val="20"/>
+              </w:rPr>
+              <w:t xml:space="preserve">0%</w:t>
             </w:r>
           </w:p>
         </w:tc>
@@ -5822,7 +5822,7 @@
                 <w:sz w:val="20"/>
                 <w:szCs w:val="20"/>
               </w:rPr>
-              <w:t xml:space="preserve">92.85%</w:t>
+              <w:t xml:space="preserve">81.81%</w:t>
             </w:r>
           </w:p>
         </w:tc>
@@ -5855,7 +5855,35 @@
                 <w:sz w:val="20"/>
                 <w:szCs w:val="20"/>
               </w:rPr>
-              <w:t xml:space="preserve">pages/admin/AdminProductos.js</w:t>
+              <w:t xml:space="preserve">hooks/useAgregarAlCarrito.js</w:t>
+            </w:r>
+          </w:p>
+        </w:tc>
+        <w:tc>
+          <w:tcPr>
+            <w:tcW w:type="dxa" w:w="1200"/>
+            <w:tcBorders>
+              <w:top w:val="single" w:color="999999" w:sz="4"/>
+              <w:left w:val="single" w:color="999999" w:sz="4"/>
+              <w:bottom w:val="single" w:color="999999" w:sz="4"/>
+              <w:right w:val="single" w:color="999999" w:sz="4"/>
+            </w:tcBorders>
+            <w:tcMar>
+              <w:top w:type="dxa" w:w="60"/>
+              <w:left w:type="dxa" w:w="100"/>
+              <w:bottom w:type="dxa" w:w="60"/>
+              <w:right w:type="dxa" w:w="100"/>
+            </w:tcMar>
+          </w:tcPr>
+          <w:p>
+            <w:r>
+              <w:rPr>
+                <w:b w:val="false"/>
+                <w:bCs w:val="false"/>
+                <w:sz w:val="20"/>
+                <w:szCs w:val="20"/>
+              </w:rPr>
+              <w:t xml:space="preserve">87.5%</w:t>
             </w:r>
           </w:p>
         </w:tc>
@@ -5911,35 +5939,7 @@
                 <w:sz w:val="20"/>
                 <w:szCs w:val="20"/>
               </w:rPr>
-              <w:t xml:space="preserve">100%</w:t>
-            </w:r>
-          </w:p>
-        </w:tc>
-        <w:tc>
-          <w:tcPr>
-            <w:tcW w:type="dxa" w:w="1200"/>
-            <w:tcBorders>
-              <w:top w:val="single" w:color="999999" w:sz="4"/>
-              <w:left w:val="single" w:color="999999" w:sz="4"/>
-              <w:bottom w:val="single" w:color="999999" w:sz="4"/>
-              <w:right w:val="single" w:color="999999" w:sz="4"/>
-            </w:tcBorders>
-            <w:tcMar>
-              <w:top w:type="dxa" w:w="60"/>
-              <w:left w:type="dxa" w:w="100"/>
-              <w:bottom w:type="dxa" w:w="60"/>
-              <w:right w:type="dxa" w:w="100"/>
-            </w:tcMar>
-          </w:tcPr>
-          <w:p>
-            <w:r>
-              <w:rPr>
-                <w:b w:val="false"/>
-                <w:bCs w:val="false"/>
-                <w:sz w:val="20"/>
-                <w:szCs w:val="20"/>
-              </w:rPr>
-              <w:t xml:space="preserve">100%</w:t>
+              <w:t xml:space="preserve">66.66%</w:t>
             </w:r>
           </w:p>
         </w:tc>
@@ -6000,7 +6000,7 @@
                 <w:sz w:val="20"/>
                 <w:szCs w:val="20"/>
               </w:rPr>
-              <w:t xml:space="preserve">utils/filtros.js</w:t>
+              <w:t xml:space="preserve">pages/Contacto.js</w:t>
             </w:r>
           </w:p>
         </w:tc>
@@ -6145,7 +6145,7 @@
                 <w:sz w:val="20"/>
                 <w:szCs w:val="20"/>
               </w:rPr>
-              <w:t xml:space="preserve">utils/formato.js</w:t>
+              <w:t xml:space="preserve">pages/Login.js</w:t>
             </w:r>
           </w:p>
         </w:tc>
@@ -6201,7 +6201,7 @@
                 <w:sz w:val="20"/>
                 <w:szCs w:val="20"/>
               </w:rPr>
-              <w:t xml:space="preserve">100%</w:t>
+              <w:t xml:space="preserve">91.66%</w:t>
             </w:r>
           </w:p>
         </w:tc>
@@ -6290,7 +6290,35 @@
                 <w:sz w:val="20"/>
                 <w:szCs w:val="20"/>
               </w:rPr>
-              <w:t xml:space="preserve">utils/pago.js</w:t>
+              <w:t xml:space="preserve">pages/Productos.js</w:t>
+            </w:r>
+          </w:p>
+        </w:tc>
+        <w:tc>
+          <w:tcPr>
+            <w:tcW w:type="dxa" w:w="1200"/>
+            <w:tcBorders>
+              <w:top w:val="single" w:color="999999" w:sz="4"/>
+              <w:left w:val="single" w:color="999999" w:sz="4"/>
+              <w:bottom w:val="single" w:color="999999" w:sz="4"/>
+              <w:right w:val="single" w:color="999999" w:sz="4"/>
+            </w:tcBorders>
+            <w:tcMar>
+              <w:top w:type="dxa" w:w="60"/>
+              <w:left w:type="dxa" w:w="100"/>
+              <w:bottom w:type="dxa" w:w="60"/>
+              <w:right w:type="dxa" w:w="100"/>
+            </w:tcMar>
+          </w:tcPr>
+          <w:p>
+            <w:r>
+              <w:rPr>
+                <w:b w:val="false"/>
+                <w:bCs w:val="false"/>
+                <w:sz w:val="20"/>
+                <w:szCs w:val="20"/>
+              </w:rPr>
+              <w:t xml:space="preserve">92.85%</w:t>
             </w:r>
           </w:p>
         </w:tc>
@@ -6346,63 +6374,35 @@
                 <w:sz w:val="20"/>
                 <w:szCs w:val="20"/>
               </w:rPr>
-              <w:t xml:space="preserve">100%</w:t>
-            </w:r>
-          </w:p>
-        </w:tc>
-        <w:tc>
-          <w:tcPr>
-            <w:tcW w:type="dxa" w:w="1200"/>
-            <w:tcBorders>
-              <w:top w:val="single" w:color="999999" w:sz="4"/>
-              <w:left w:val="single" w:color="999999" w:sz="4"/>
-              <w:bottom w:val="single" w:color="999999" w:sz="4"/>
-              <w:right w:val="single" w:color="999999" w:sz="4"/>
-            </w:tcBorders>
-            <w:tcMar>
-              <w:top w:type="dxa" w:w="60"/>
-              <w:left w:type="dxa" w:w="100"/>
-              <w:bottom w:type="dxa" w:w="60"/>
-              <w:right w:type="dxa" w:w="100"/>
-            </w:tcMar>
-          </w:tcPr>
-          <w:p>
-            <w:r>
-              <w:rPr>
-                <w:b w:val="false"/>
-                <w:bCs w:val="false"/>
-                <w:sz w:val="20"/>
-                <w:szCs w:val="20"/>
-              </w:rPr>
-              <w:t xml:space="preserve">100%</w:t>
-            </w:r>
-          </w:p>
-        </w:tc>
-        <w:tc>
-          <w:tcPr>
-            <w:tcW w:type="dxa" w:w="1200"/>
-            <w:tcBorders>
-              <w:top w:val="single" w:color="999999" w:sz="4"/>
-              <w:left w:val="single" w:color="999999" w:sz="4"/>
-              <w:bottom w:val="single" w:color="999999" w:sz="4"/>
-              <w:right w:val="single" w:color="999999" w:sz="4"/>
-            </w:tcBorders>
-            <w:tcMar>
-              <w:top w:type="dxa" w:w="60"/>
-              <w:left w:type="dxa" w:w="100"/>
-              <w:bottom w:type="dxa" w:w="60"/>
-              <w:right w:type="dxa" w:w="100"/>
-            </w:tcMar>
-          </w:tcPr>
-          <w:p>
-            <w:r>
-              <w:rPr>
-                <w:b w:val="false"/>
-                <w:bCs w:val="false"/>
-                <w:sz w:val="20"/>
-                <w:szCs w:val="20"/>
-              </w:rPr>
-              <w:t xml:space="preserve">100%</w:t>
+              <w:t xml:space="preserve">80%</w:t>
+            </w:r>
+          </w:p>
+        </w:tc>
+        <w:tc>
+          <w:tcPr>
+            <w:tcW w:type="dxa" w:w="1200"/>
+            <w:tcBorders>
+              <w:top w:val="single" w:color="999999" w:sz="4"/>
+              <w:left w:val="single" w:color="999999" w:sz="4"/>
+              <w:bottom w:val="single" w:color="999999" w:sz="4"/>
+              <w:right w:val="single" w:color="999999" w:sz="4"/>
+            </w:tcBorders>
+            <w:tcMar>
+              <w:top w:type="dxa" w:w="60"/>
+              <w:left w:type="dxa" w:w="100"/>
+              <w:bottom w:type="dxa" w:w="60"/>
+              <w:right w:type="dxa" w:w="100"/>
+            </w:tcMar>
+          </w:tcPr>
+          <w:p>
+            <w:r>
+              <w:rPr>
+                <w:b w:val="false"/>
+                <w:bCs w:val="false"/>
+                <w:sz w:val="20"/>
+                <w:szCs w:val="20"/>
+              </w:rPr>
+              <w:t xml:space="preserve">92.85%</w:t>
             </w:r>
           </w:p>
         </w:tc>
@@ -6435,6 +6435,1311 @@
                 <w:sz w:val="20"/>
                 <w:szCs w:val="20"/>
               </w:rPr>
+              <w:t xml:space="preserve">pages/admin/AdminOrdenes.js</w:t>
+            </w:r>
+          </w:p>
+        </w:tc>
+        <w:tc>
+          <w:tcPr>
+            <w:tcW w:type="dxa" w:w="1200"/>
+            <w:tcBorders>
+              <w:top w:val="single" w:color="999999" w:sz="4"/>
+              <w:left w:val="single" w:color="999999" w:sz="4"/>
+              <w:bottom w:val="single" w:color="999999" w:sz="4"/>
+              <w:right w:val="single" w:color="999999" w:sz="4"/>
+            </w:tcBorders>
+            <w:tcMar>
+              <w:top w:type="dxa" w:w="60"/>
+              <w:left w:type="dxa" w:w="100"/>
+              <w:bottom w:type="dxa" w:w="60"/>
+              <w:right w:type="dxa" w:w="100"/>
+            </w:tcMar>
+          </w:tcPr>
+          <w:p>
+            <w:r>
+              <w:rPr>
+                <w:b w:val="false"/>
+                <w:bCs w:val="false"/>
+                <w:sz w:val="20"/>
+                <w:szCs w:val="20"/>
+              </w:rPr>
+              <w:t xml:space="preserve">100%</w:t>
+            </w:r>
+          </w:p>
+        </w:tc>
+        <w:tc>
+          <w:tcPr>
+            <w:tcW w:type="dxa" w:w="1200"/>
+            <w:tcBorders>
+              <w:top w:val="single" w:color="999999" w:sz="4"/>
+              <w:left w:val="single" w:color="999999" w:sz="4"/>
+              <w:bottom w:val="single" w:color="999999" w:sz="4"/>
+              <w:right w:val="single" w:color="999999" w:sz="4"/>
+            </w:tcBorders>
+            <w:tcMar>
+              <w:top w:type="dxa" w:w="60"/>
+              <w:left w:type="dxa" w:w="100"/>
+              <w:bottom w:type="dxa" w:w="60"/>
+              <w:right w:type="dxa" w:w="100"/>
+            </w:tcMar>
+          </w:tcPr>
+          <w:p>
+            <w:r>
+              <w:rPr>
+                <w:b w:val="false"/>
+                <w:bCs w:val="false"/>
+                <w:sz w:val="20"/>
+                <w:szCs w:val="20"/>
+              </w:rPr>
+              <w:t xml:space="preserve">100%</w:t>
+            </w:r>
+          </w:p>
+        </w:tc>
+        <w:tc>
+          <w:tcPr>
+            <w:tcW w:type="dxa" w:w="1200"/>
+            <w:tcBorders>
+              <w:top w:val="single" w:color="999999" w:sz="4"/>
+              <w:left w:val="single" w:color="999999" w:sz="4"/>
+              <w:bottom w:val="single" w:color="999999" w:sz="4"/>
+              <w:right w:val="single" w:color="999999" w:sz="4"/>
+            </w:tcBorders>
+            <w:tcMar>
+              <w:top w:type="dxa" w:w="60"/>
+              <w:left w:type="dxa" w:w="100"/>
+              <w:bottom w:type="dxa" w:w="60"/>
+              <w:right w:type="dxa" w:w="100"/>
+            </w:tcMar>
+          </w:tcPr>
+          <w:p>
+            <w:r>
+              <w:rPr>
+                <w:b w:val="false"/>
+                <w:bCs w:val="false"/>
+                <w:sz w:val="20"/>
+                <w:szCs w:val="20"/>
+              </w:rPr>
+              <w:t xml:space="preserve">100%</w:t>
+            </w:r>
+          </w:p>
+        </w:tc>
+        <w:tc>
+          <w:tcPr>
+            <w:tcW w:type="dxa" w:w="1200"/>
+            <w:tcBorders>
+              <w:top w:val="single" w:color="999999" w:sz="4"/>
+              <w:left w:val="single" w:color="999999" w:sz="4"/>
+              <w:bottom w:val="single" w:color="999999" w:sz="4"/>
+              <w:right w:val="single" w:color="999999" w:sz="4"/>
+            </w:tcBorders>
+            <w:tcMar>
+              <w:top w:type="dxa" w:w="60"/>
+              <w:left w:type="dxa" w:w="100"/>
+              <w:bottom w:type="dxa" w:w="60"/>
+              <w:right w:type="dxa" w:w="100"/>
+            </w:tcMar>
+          </w:tcPr>
+          <w:p>
+            <w:r>
+              <w:rPr>
+                <w:b w:val="false"/>
+                <w:bCs w:val="false"/>
+                <w:sz w:val="20"/>
+                <w:szCs w:val="20"/>
+              </w:rPr>
+              <w:t xml:space="preserve">100%</w:t>
+            </w:r>
+          </w:p>
+        </w:tc>
+      </w:tr>
+      <w:tr>
+        <w:trPr>
+          <w:tblHeader w:val="off"/>
+        </w:trPr>
+        <w:tc>
+          <w:tcPr>
+            <w:tcW w:type="dxa" w:w="3700"/>
+            <w:tcBorders>
+              <w:top w:val="single" w:color="999999" w:sz="4"/>
+              <w:left w:val="single" w:color="999999" w:sz="4"/>
+              <w:bottom w:val="single" w:color="999999" w:sz="4"/>
+              <w:right w:val="single" w:color="999999" w:sz="4"/>
+            </w:tcBorders>
+            <w:tcMar>
+              <w:top w:type="dxa" w:w="60"/>
+              <w:left w:type="dxa" w:w="100"/>
+              <w:bottom w:type="dxa" w:w="60"/>
+              <w:right w:type="dxa" w:w="100"/>
+            </w:tcMar>
+          </w:tcPr>
+          <w:p>
+            <w:r>
+              <w:rPr>
+                <w:b w:val="false"/>
+                <w:bCs w:val="false"/>
+                <w:sz w:val="20"/>
+                <w:szCs w:val="20"/>
+              </w:rPr>
+              <w:t xml:space="preserve">pages/admin/AdminProductos.js</w:t>
+            </w:r>
+          </w:p>
+        </w:tc>
+        <w:tc>
+          <w:tcPr>
+            <w:tcW w:type="dxa" w:w="1200"/>
+            <w:tcBorders>
+              <w:top w:val="single" w:color="999999" w:sz="4"/>
+              <w:left w:val="single" w:color="999999" w:sz="4"/>
+              <w:bottom w:val="single" w:color="999999" w:sz="4"/>
+              <w:right w:val="single" w:color="999999" w:sz="4"/>
+            </w:tcBorders>
+            <w:tcMar>
+              <w:top w:type="dxa" w:w="60"/>
+              <w:left w:type="dxa" w:w="100"/>
+              <w:bottom w:type="dxa" w:w="60"/>
+              <w:right w:type="dxa" w:w="100"/>
+            </w:tcMar>
+          </w:tcPr>
+          <w:p>
+            <w:r>
+              <w:rPr>
+                <w:b w:val="false"/>
+                <w:bCs w:val="false"/>
+                <w:sz w:val="20"/>
+                <w:szCs w:val="20"/>
+              </w:rPr>
+              <w:t xml:space="preserve">100%</w:t>
+            </w:r>
+          </w:p>
+        </w:tc>
+        <w:tc>
+          <w:tcPr>
+            <w:tcW w:type="dxa" w:w="1200"/>
+            <w:tcBorders>
+              <w:top w:val="single" w:color="999999" w:sz="4"/>
+              <w:left w:val="single" w:color="999999" w:sz="4"/>
+              <w:bottom w:val="single" w:color="999999" w:sz="4"/>
+              <w:right w:val="single" w:color="999999" w:sz="4"/>
+            </w:tcBorders>
+            <w:tcMar>
+              <w:top w:type="dxa" w:w="60"/>
+              <w:left w:type="dxa" w:w="100"/>
+              <w:bottom w:type="dxa" w:w="60"/>
+              <w:right w:type="dxa" w:w="100"/>
+            </w:tcMar>
+          </w:tcPr>
+          <w:p>
+            <w:r>
+              <w:rPr>
+                <w:b w:val="false"/>
+                <w:bCs w:val="false"/>
+                <w:sz w:val="20"/>
+                <w:szCs w:val="20"/>
+              </w:rPr>
+              <w:t xml:space="preserve">100%</w:t>
+            </w:r>
+          </w:p>
+        </w:tc>
+        <w:tc>
+          <w:tcPr>
+            <w:tcW w:type="dxa" w:w="1200"/>
+            <w:tcBorders>
+              <w:top w:val="single" w:color="999999" w:sz="4"/>
+              <w:left w:val="single" w:color="999999" w:sz="4"/>
+              <w:bottom w:val="single" w:color="999999" w:sz="4"/>
+              <w:right w:val="single" w:color="999999" w:sz="4"/>
+            </w:tcBorders>
+            <w:tcMar>
+              <w:top w:type="dxa" w:w="60"/>
+              <w:left w:type="dxa" w:w="100"/>
+              <w:bottom w:type="dxa" w:w="60"/>
+              <w:right w:type="dxa" w:w="100"/>
+            </w:tcMar>
+          </w:tcPr>
+          <w:p>
+            <w:r>
+              <w:rPr>
+                <w:b w:val="false"/>
+                <w:bCs w:val="false"/>
+                <w:sz w:val="20"/>
+                <w:szCs w:val="20"/>
+              </w:rPr>
+              <w:t xml:space="preserve">100%</w:t>
+            </w:r>
+          </w:p>
+        </w:tc>
+        <w:tc>
+          <w:tcPr>
+            <w:tcW w:type="dxa" w:w="1200"/>
+            <w:tcBorders>
+              <w:top w:val="single" w:color="999999" w:sz="4"/>
+              <w:left w:val="single" w:color="999999" w:sz="4"/>
+              <w:bottom w:val="single" w:color="999999" w:sz="4"/>
+              <w:right w:val="single" w:color="999999" w:sz="4"/>
+            </w:tcBorders>
+            <w:tcMar>
+              <w:top w:type="dxa" w:w="60"/>
+              <w:left w:type="dxa" w:w="100"/>
+              <w:bottom w:type="dxa" w:w="60"/>
+              <w:right w:type="dxa" w:w="100"/>
+            </w:tcMar>
+          </w:tcPr>
+          <w:p>
+            <w:r>
+              <w:rPr>
+                <w:b w:val="false"/>
+                <w:bCs w:val="false"/>
+                <w:sz w:val="20"/>
+                <w:szCs w:val="20"/>
+              </w:rPr>
+              <w:t xml:space="preserve">100%</w:t>
+            </w:r>
+          </w:p>
+        </w:tc>
+      </w:tr>
+      <w:tr>
+        <w:trPr>
+          <w:tblHeader w:val="off"/>
+        </w:trPr>
+        <w:tc>
+          <w:tcPr>
+            <w:tcW w:type="dxa" w:w="3700"/>
+            <w:tcBorders>
+              <w:top w:val="single" w:color="999999" w:sz="4"/>
+              <w:left w:val="single" w:color="999999" w:sz="4"/>
+              <w:bottom w:val="single" w:color="999999" w:sz="4"/>
+              <w:right w:val="single" w:color="999999" w:sz="4"/>
+            </w:tcBorders>
+            <w:tcMar>
+              <w:top w:type="dxa" w:w="60"/>
+              <w:left w:type="dxa" w:w="100"/>
+              <w:bottom w:type="dxa" w:w="60"/>
+              <w:right w:type="dxa" w:w="100"/>
+            </w:tcMar>
+          </w:tcPr>
+          <w:p>
+            <w:r>
+              <w:rPr>
+                <w:b w:val="false"/>
+                <w:bCs w:val="false"/>
+                <w:sz w:val="20"/>
+                <w:szCs w:val="20"/>
+              </w:rPr>
+              <w:t xml:space="preserve">pages/admin/AdminUsuarios.js</w:t>
+            </w:r>
+          </w:p>
+        </w:tc>
+        <w:tc>
+          <w:tcPr>
+            <w:tcW w:type="dxa" w:w="1200"/>
+            <w:tcBorders>
+              <w:top w:val="single" w:color="999999" w:sz="4"/>
+              <w:left w:val="single" w:color="999999" w:sz="4"/>
+              <w:bottom w:val="single" w:color="999999" w:sz="4"/>
+              <w:right w:val="single" w:color="999999" w:sz="4"/>
+            </w:tcBorders>
+            <w:tcMar>
+              <w:top w:type="dxa" w:w="60"/>
+              <w:left w:type="dxa" w:w="100"/>
+              <w:bottom w:type="dxa" w:w="60"/>
+              <w:right w:type="dxa" w:w="100"/>
+            </w:tcMar>
+          </w:tcPr>
+          <w:p>
+            <w:r>
+              <w:rPr>
+                <w:b w:val="false"/>
+                <w:bCs w:val="false"/>
+                <w:sz w:val="20"/>
+                <w:szCs w:val="20"/>
+              </w:rPr>
+              <w:t xml:space="preserve">100%</w:t>
+            </w:r>
+          </w:p>
+        </w:tc>
+        <w:tc>
+          <w:tcPr>
+            <w:tcW w:type="dxa" w:w="1200"/>
+            <w:tcBorders>
+              <w:top w:val="single" w:color="999999" w:sz="4"/>
+              <w:left w:val="single" w:color="999999" w:sz="4"/>
+              <w:bottom w:val="single" w:color="999999" w:sz="4"/>
+              <w:right w:val="single" w:color="999999" w:sz="4"/>
+            </w:tcBorders>
+            <w:tcMar>
+              <w:top w:type="dxa" w:w="60"/>
+              <w:left w:type="dxa" w:w="100"/>
+              <w:bottom w:type="dxa" w:w="60"/>
+              <w:right w:type="dxa" w:w="100"/>
+            </w:tcMar>
+          </w:tcPr>
+          <w:p>
+            <w:r>
+              <w:rPr>
+                <w:b w:val="false"/>
+                <w:bCs w:val="false"/>
+                <w:sz w:val="20"/>
+                <w:szCs w:val="20"/>
+              </w:rPr>
+              <w:t xml:space="preserve">100%</w:t>
+            </w:r>
+          </w:p>
+        </w:tc>
+        <w:tc>
+          <w:tcPr>
+            <w:tcW w:type="dxa" w:w="1200"/>
+            <w:tcBorders>
+              <w:top w:val="single" w:color="999999" w:sz="4"/>
+              <w:left w:val="single" w:color="999999" w:sz="4"/>
+              <w:bottom w:val="single" w:color="999999" w:sz="4"/>
+              <w:right w:val="single" w:color="999999" w:sz="4"/>
+            </w:tcBorders>
+            <w:tcMar>
+              <w:top w:type="dxa" w:w="60"/>
+              <w:left w:type="dxa" w:w="100"/>
+              <w:bottom w:type="dxa" w:w="60"/>
+              <w:right w:type="dxa" w:w="100"/>
+            </w:tcMar>
+          </w:tcPr>
+          <w:p>
+            <w:r>
+              <w:rPr>
+                <w:b w:val="false"/>
+                <w:bCs w:val="false"/>
+                <w:sz w:val="20"/>
+                <w:szCs w:val="20"/>
+              </w:rPr>
+              <w:t xml:space="preserve">100%</w:t>
+            </w:r>
+          </w:p>
+        </w:tc>
+        <w:tc>
+          <w:tcPr>
+            <w:tcW w:type="dxa" w:w="1200"/>
+            <w:tcBorders>
+              <w:top w:val="single" w:color="999999" w:sz="4"/>
+              <w:left w:val="single" w:color="999999" w:sz="4"/>
+              <w:bottom w:val="single" w:color="999999" w:sz="4"/>
+              <w:right w:val="single" w:color="999999" w:sz="4"/>
+            </w:tcBorders>
+            <w:tcMar>
+              <w:top w:type="dxa" w:w="60"/>
+              <w:left w:type="dxa" w:w="100"/>
+              <w:bottom w:type="dxa" w:w="60"/>
+              <w:right w:type="dxa" w:w="100"/>
+            </w:tcMar>
+          </w:tcPr>
+          <w:p>
+            <w:r>
+              <w:rPr>
+                <w:b w:val="false"/>
+                <w:bCs w:val="false"/>
+                <w:sz w:val="20"/>
+                <w:szCs w:val="20"/>
+              </w:rPr>
+              <w:t xml:space="preserve">100%</w:t>
+            </w:r>
+          </w:p>
+        </w:tc>
+      </w:tr>
+      <w:tr>
+        <w:trPr>
+          <w:tblHeader w:val="off"/>
+        </w:trPr>
+        <w:tc>
+          <w:tcPr>
+            <w:tcW w:type="dxa" w:w="3700"/>
+            <w:tcBorders>
+              <w:top w:val="single" w:color="999999" w:sz="4"/>
+              <w:left w:val="single" w:color="999999" w:sz="4"/>
+              <w:bottom w:val="single" w:color="999999" w:sz="4"/>
+              <w:right w:val="single" w:color="999999" w:sz="4"/>
+            </w:tcBorders>
+            <w:tcMar>
+              <w:top w:type="dxa" w:w="60"/>
+              <w:left w:type="dxa" w:w="100"/>
+              <w:bottom w:type="dxa" w:w="60"/>
+              <w:right w:type="dxa" w:w="100"/>
+            </w:tcMar>
+          </w:tcPr>
+          <w:p>
+            <w:r>
+              <w:rPr>
+                <w:b w:val="false"/>
+                <w:bCs w:val="false"/>
+                <w:sz w:val="20"/>
+                <w:szCs w:val="20"/>
+              </w:rPr>
+              <w:t xml:space="preserve">pages/admin/Boleta.js</w:t>
+            </w:r>
+          </w:p>
+        </w:tc>
+        <w:tc>
+          <w:tcPr>
+            <w:tcW w:type="dxa" w:w="1200"/>
+            <w:tcBorders>
+              <w:top w:val="single" w:color="999999" w:sz="4"/>
+              <w:left w:val="single" w:color="999999" w:sz="4"/>
+              <w:bottom w:val="single" w:color="999999" w:sz="4"/>
+              <w:right w:val="single" w:color="999999" w:sz="4"/>
+            </w:tcBorders>
+            <w:tcMar>
+              <w:top w:type="dxa" w:w="60"/>
+              <w:left w:type="dxa" w:w="100"/>
+              <w:bottom w:type="dxa" w:w="60"/>
+              <w:right w:type="dxa" w:w="100"/>
+            </w:tcMar>
+          </w:tcPr>
+          <w:p>
+            <w:r>
+              <w:rPr>
+                <w:b w:val="false"/>
+                <w:bCs w:val="false"/>
+                <w:sz w:val="20"/>
+                <w:szCs w:val="20"/>
+              </w:rPr>
+              <w:t xml:space="preserve">100%</w:t>
+            </w:r>
+          </w:p>
+        </w:tc>
+        <w:tc>
+          <w:tcPr>
+            <w:tcW w:type="dxa" w:w="1200"/>
+            <w:tcBorders>
+              <w:top w:val="single" w:color="999999" w:sz="4"/>
+              <w:left w:val="single" w:color="999999" w:sz="4"/>
+              <w:bottom w:val="single" w:color="999999" w:sz="4"/>
+              <w:right w:val="single" w:color="999999" w:sz="4"/>
+            </w:tcBorders>
+            <w:tcMar>
+              <w:top w:type="dxa" w:w="60"/>
+              <w:left w:type="dxa" w:w="100"/>
+              <w:bottom w:type="dxa" w:w="60"/>
+              <w:right w:type="dxa" w:w="100"/>
+            </w:tcMar>
+          </w:tcPr>
+          <w:p>
+            <w:r>
+              <w:rPr>
+                <w:b w:val="false"/>
+                <w:bCs w:val="false"/>
+                <w:sz w:val="20"/>
+                <w:szCs w:val="20"/>
+              </w:rPr>
+              <w:t xml:space="preserve">100%</w:t>
+            </w:r>
+          </w:p>
+        </w:tc>
+        <w:tc>
+          <w:tcPr>
+            <w:tcW w:type="dxa" w:w="1200"/>
+            <w:tcBorders>
+              <w:top w:val="single" w:color="999999" w:sz="4"/>
+              <w:left w:val="single" w:color="999999" w:sz="4"/>
+              <w:bottom w:val="single" w:color="999999" w:sz="4"/>
+              <w:right w:val="single" w:color="999999" w:sz="4"/>
+            </w:tcBorders>
+            <w:tcMar>
+              <w:top w:type="dxa" w:w="60"/>
+              <w:left w:type="dxa" w:w="100"/>
+              <w:bottom w:type="dxa" w:w="60"/>
+              <w:right w:type="dxa" w:w="100"/>
+            </w:tcMar>
+          </w:tcPr>
+          <w:p>
+            <w:r>
+              <w:rPr>
+                <w:b w:val="false"/>
+                <w:bCs w:val="false"/>
+                <w:sz w:val="20"/>
+                <w:szCs w:val="20"/>
+              </w:rPr>
+              <w:t xml:space="preserve">100%</w:t>
+            </w:r>
+          </w:p>
+        </w:tc>
+        <w:tc>
+          <w:tcPr>
+            <w:tcW w:type="dxa" w:w="1200"/>
+            <w:tcBorders>
+              <w:top w:val="single" w:color="999999" w:sz="4"/>
+              <w:left w:val="single" w:color="999999" w:sz="4"/>
+              <w:bottom w:val="single" w:color="999999" w:sz="4"/>
+              <w:right w:val="single" w:color="999999" w:sz="4"/>
+            </w:tcBorders>
+            <w:tcMar>
+              <w:top w:type="dxa" w:w="60"/>
+              <w:left w:type="dxa" w:w="100"/>
+              <w:bottom w:type="dxa" w:w="60"/>
+              <w:right w:type="dxa" w:w="100"/>
+            </w:tcMar>
+          </w:tcPr>
+          <w:p>
+            <w:r>
+              <w:rPr>
+                <w:b w:val="false"/>
+                <w:bCs w:val="false"/>
+                <w:sz w:val="20"/>
+                <w:szCs w:val="20"/>
+              </w:rPr>
+              <w:t xml:space="preserve">100%</w:t>
+            </w:r>
+          </w:p>
+        </w:tc>
+      </w:tr>
+      <w:tr>
+        <w:trPr>
+          <w:tblHeader w:val="off"/>
+        </w:trPr>
+        <w:tc>
+          <w:tcPr>
+            <w:tcW w:type="dxa" w:w="3700"/>
+            <w:tcBorders>
+              <w:top w:val="single" w:color="999999" w:sz="4"/>
+              <w:left w:val="single" w:color="999999" w:sz="4"/>
+              <w:bottom w:val="single" w:color="999999" w:sz="4"/>
+              <w:right w:val="single" w:color="999999" w:sz="4"/>
+            </w:tcBorders>
+            <w:tcMar>
+              <w:top w:type="dxa" w:w="60"/>
+              <w:left w:type="dxa" w:w="100"/>
+              <w:bottom w:type="dxa" w:w="60"/>
+              <w:right w:type="dxa" w:w="100"/>
+            </w:tcMar>
+          </w:tcPr>
+          <w:p>
+            <w:r>
+              <w:rPr>
+                <w:b w:val="false"/>
+                <w:bCs w:val="false"/>
+                <w:sz w:val="20"/>
+                <w:szCs w:val="20"/>
+              </w:rPr>
+              <w:t xml:space="preserve">pages/admin/HistorialCompras.js</w:t>
+            </w:r>
+          </w:p>
+        </w:tc>
+        <w:tc>
+          <w:tcPr>
+            <w:tcW w:type="dxa" w:w="1200"/>
+            <w:tcBorders>
+              <w:top w:val="single" w:color="999999" w:sz="4"/>
+              <w:left w:val="single" w:color="999999" w:sz="4"/>
+              <w:bottom w:val="single" w:color="999999" w:sz="4"/>
+              <w:right w:val="single" w:color="999999" w:sz="4"/>
+            </w:tcBorders>
+            <w:tcMar>
+              <w:top w:type="dxa" w:w="60"/>
+              <w:left w:type="dxa" w:w="100"/>
+              <w:bottom w:type="dxa" w:w="60"/>
+              <w:right w:type="dxa" w:w="100"/>
+            </w:tcMar>
+          </w:tcPr>
+          <w:p>
+            <w:r>
+              <w:rPr>
+                <w:b w:val="false"/>
+                <w:bCs w:val="false"/>
+                <w:sz w:val="20"/>
+                <w:szCs w:val="20"/>
+              </w:rPr>
+              <w:t xml:space="preserve">100%</w:t>
+            </w:r>
+          </w:p>
+        </w:tc>
+        <w:tc>
+          <w:tcPr>
+            <w:tcW w:type="dxa" w:w="1200"/>
+            <w:tcBorders>
+              <w:top w:val="single" w:color="999999" w:sz="4"/>
+              <w:left w:val="single" w:color="999999" w:sz="4"/>
+              <w:bottom w:val="single" w:color="999999" w:sz="4"/>
+              <w:right w:val="single" w:color="999999" w:sz="4"/>
+            </w:tcBorders>
+            <w:tcMar>
+              <w:top w:type="dxa" w:w="60"/>
+              <w:left w:type="dxa" w:w="100"/>
+              <w:bottom w:type="dxa" w:w="60"/>
+              <w:right w:type="dxa" w:w="100"/>
+            </w:tcMar>
+          </w:tcPr>
+          <w:p>
+            <w:r>
+              <w:rPr>
+                <w:b w:val="false"/>
+                <w:bCs w:val="false"/>
+                <w:sz w:val="20"/>
+                <w:szCs w:val="20"/>
+              </w:rPr>
+              <w:t xml:space="preserve">100%</w:t>
+            </w:r>
+          </w:p>
+        </w:tc>
+        <w:tc>
+          <w:tcPr>
+            <w:tcW w:type="dxa" w:w="1200"/>
+            <w:tcBorders>
+              <w:top w:val="single" w:color="999999" w:sz="4"/>
+              <w:left w:val="single" w:color="999999" w:sz="4"/>
+              <w:bottom w:val="single" w:color="999999" w:sz="4"/>
+              <w:right w:val="single" w:color="999999" w:sz="4"/>
+            </w:tcBorders>
+            <w:tcMar>
+              <w:top w:type="dxa" w:w="60"/>
+              <w:left w:type="dxa" w:w="100"/>
+              <w:bottom w:type="dxa" w:w="60"/>
+              <w:right w:type="dxa" w:w="100"/>
+            </w:tcMar>
+          </w:tcPr>
+          <w:p>
+            <w:r>
+              <w:rPr>
+                <w:b w:val="false"/>
+                <w:bCs w:val="false"/>
+                <w:sz w:val="20"/>
+                <w:szCs w:val="20"/>
+              </w:rPr>
+              <w:t xml:space="preserve">100%</w:t>
+            </w:r>
+          </w:p>
+        </w:tc>
+        <w:tc>
+          <w:tcPr>
+            <w:tcW w:type="dxa" w:w="1200"/>
+            <w:tcBorders>
+              <w:top w:val="single" w:color="999999" w:sz="4"/>
+              <w:left w:val="single" w:color="999999" w:sz="4"/>
+              <w:bottom w:val="single" w:color="999999" w:sz="4"/>
+              <w:right w:val="single" w:color="999999" w:sz="4"/>
+            </w:tcBorders>
+            <w:tcMar>
+              <w:top w:type="dxa" w:w="60"/>
+              <w:left w:type="dxa" w:w="100"/>
+              <w:bottom w:type="dxa" w:w="60"/>
+              <w:right w:type="dxa" w:w="100"/>
+            </w:tcMar>
+          </w:tcPr>
+          <w:p>
+            <w:r>
+              <w:rPr>
+                <w:b w:val="false"/>
+                <w:bCs w:val="false"/>
+                <w:sz w:val="20"/>
+                <w:szCs w:val="20"/>
+              </w:rPr>
+              <w:t xml:space="preserve">100%</w:t>
+            </w:r>
+          </w:p>
+        </w:tc>
+      </w:tr>
+      <w:tr>
+        <w:trPr>
+          <w:tblHeader w:val="off"/>
+        </w:trPr>
+        <w:tc>
+          <w:tcPr>
+            <w:tcW w:type="dxa" w:w="3700"/>
+            <w:tcBorders>
+              <w:top w:val="single" w:color="999999" w:sz="4"/>
+              <w:left w:val="single" w:color="999999" w:sz="4"/>
+              <w:bottom w:val="single" w:color="999999" w:sz="4"/>
+              <w:right w:val="single" w:color="999999" w:sz="4"/>
+            </w:tcBorders>
+            <w:tcMar>
+              <w:top w:type="dxa" w:w="60"/>
+              <w:left w:type="dxa" w:w="100"/>
+              <w:bottom w:type="dxa" w:w="60"/>
+              <w:right w:type="dxa" w:w="100"/>
+            </w:tcMar>
+          </w:tcPr>
+          <w:p>
+            <w:r>
+              <w:rPr>
+                <w:b w:val="false"/>
+                <w:bCs w:val="false"/>
+                <w:sz w:val="20"/>
+                <w:szCs w:val="20"/>
+              </w:rPr>
+              <w:t xml:space="preserve">pages/admin/UsuarioForm.js</w:t>
+            </w:r>
+          </w:p>
+        </w:tc>
+        <w:tc>
+          <w:tcPr>
+            <w:tcW w:type="dxa" w:w="1200"/>
+            <w:tcBorders>
+              <w:top w:val="single" w:color="999999" w:sz="4"/>
+              <w:left w:val="single" w:color="999999" w:sz="4"/>
+              <w:bottom w:val="single" w:color="999999" w:sz="4"/>
+              <w:right w:val="single" w:color="999999" w:sz="4"/>
+            </w:tcBorders>
+            <w:tcMar>
+              <w:top w:type="dxa" w:w="60"/>
+              <w:left w:type="dxa" w:w="100"/>
+              <w:bottom w:type="dxa" w:w="60"/>
+              <w:right w:type="dxa" w:w="100"/>
+            </w:tcMar>
+          </w:tcPr>
+          <w:p>
+            <w:r>
+              <w:rPr>
+                <w:b w:val="false"/>
+                <w:bCs w:val="false"/>
+                <w:sz w:val="20"/>
+                <w:szCs w:val="20"/>
+              </w:rPr>
+              <w:t xml:space="preserve">95.23%</w:t>
+            </w:r>
+          </w:p>
+        </w:tc>
+        <w:tc>
+          <w:tcPr>
+            <w:tcW w:type="dxa" w:w="1200"/>
+            <w:tcBorders>
+              <w:top w:val="single" w:color="999999" w:sz="4"/>
+              <w:left w:val="single" w:color="999999" w:sz="4"/>
+              <w:bottom w:val="single" w:color="999999" w:sz="4"/>
+              <w:right w:val="single" w:color="999999" w:sz="4"/>
+            </w:tcBorders>
+            <w:tcMar>
+              <w:top w:type="dxa" w:w="60"/>
+              <w:left w:type="dxa" w:w="100"/>
+              <w:bottom w:type="dxa" w:w="60"/>
+              <w:right w:type="dxa" w:w="100"/>
+            </w:tcMar>
+          </w:tcPr>
+          <w:p>
+            <w:r>
+              <w:rPr>
+                <w:b w:val="false"/>
+                <w:bCs w:val="false"/>
+                <w:sz w:val="20"/>
+                <w:szCs w:val="20"/>
+              </w:rPr>
+              <w:t xml:space="preserve">66%</w:t>
+            </w:r>
+          </w:p>
+        </w:tc>
+        <w:tc>
+          <w:tcPr>
+            <w:tcW w:type="dxa" w:w="1200"/>
+            <w:tcBorders>
+              <w:top w:val="single" w:color="999999" w:sz="4"/>
+              <w:left w:val="single" w:color="999999" w:sz="4"/>
+              <w:bottom w:val="single" w:color="999999" w:sz="4"/>
+              <w:right w:val="single" w:color="999999" w:sz="4"/>
+            </w:tcBorders>
+            <w:tcMar>
+              <w:top w:type="dxa" w:w="60"/>
+              <w:left w:type="dxa" w:w="100"/>
+              <w:bottom w:type="dxa" w:w="60"/>
+              <w:right w:type="dxa" w:w="100"/>
+            </w:tcMar>
+          </w:tcPr>
+          <w:p>
+            <w:r>
+              <w:rPr>
+                <w:b w:val="false"/>
+                <w:bCs w:val="false"/>
+                <w:sz w:val="20"/>
+                <w:szCs w:val="20"/>
+              </w:rPr>
+              <w:t xml:space="preserve">100%</w:t>
+            </w:r>
+          </w:p>
+        </w:tc>
+        <w:tc>
+          <w:tcPr>
+            <w:tcW w:type="dxa" w:w="1200"/>
+            <w:tcBorders>
+              <w:top w:val="single" w:color="999999" w:sz="4"/>
+              <w:left w:val="single" w:color="999999" w:sz="4"/>
+              <w:bottom w:val="single" w:color="999999" w:sz="4"/>
+              <w:right w:val="single" w:color="999999" w:sz="4"/>
+            </w:tcBorders>
+            <w:tcMar>
+              <w:top w:type="dxa" w:w="60"/>
+              <w:left w:type="dxa" w:w="100"/>
+              <w:bottom w:type="dxa" w:w="60"/>
+              <w:right w:type="dxa" w:w="100"/>
+            </w:tcMar>
+          </w:tcPr>
+          <w:p>
+            <w:r>
+              <w:rPr>
+                <w:b w:val="false"/>
+                <w:bCs w:val="false"/>
+                <w:sz w:val="20"/>
+                <w:szCs w:val="20"/>
+              </w:rPr>
+              <w:t xml:space="preserve">93.93%</w:t>
+            </w:r>
+          </w:p>
+        </w:tc>
+      </w:tr>
+      <w:tr>
+        <w:trPr>
+          <w:tblHeader w:val="off"/>
+        </w:trPr>
+        <w:tc>
+          <w:tcPr>
+            <w:tcW w:type="dxa" w:w="3700"/>
+            <w:tcBorders>
+              <w:top w:val="single" w:color="999999" w:sz="4"/>
+              <w:left w:val="single" w:color="999999" w:sz="4"/>
+              <w:bottom w:val="single" w:color="999999" w:sz="4"/>
+              <w:right w:val="single" w:color="999999" w:sz="4"/>
+            </w:tcBorders>
+            <w:tcMar>
+              <w:top w:type="dxa" w:w="60"/>
+              <w:left w:type="dxa" w:w="100"/>
+              <w:bottom w:type="dxa" w:w="60"/>
+              <w:right w:type="dxa" w:w="100"/>
+            </w:tcMar>
+          </w:tcPr>
+          <w:p>
+            <w:r>
+              <w:rPr>
+                <w:b w:val="false"/>
+                <w:bCs w:val="false"/>
+                <w:sz w:val="20"/>
+                <w:szCs w:val="20"/>
+              </w:rPr>
+              <w:t xml:space="preserve">utils/filtros.js</w:t>
+            </w:r>
+          </w:p>
+        </w:tc>
+        <w:tc>
+          <w:tcPr>
+            <w:tcW w:type="dxa" w:w="1200"/>
+            <w:tcBorders>
+              <w:top w:val="single" w:color="999999" w:sz="4"/>
+              <w:left w:val="single" w:color="999999" w:sz="4"/>
+              <w:bottom w:val="single" w:color="999999" w:sz="4"/>
+              <w:right w:val="single" w:color="999999" w:sz="4"/>
+            </w:tcBorders>
+            <w:tcMar>
+              <w:top w:type="dxa" w:w="60"/>
+              <w:left w:type="dxa" w:w="100"/>
+              <w:bottom w:type="dxa" w:w="60"/>
+              <w:right w:type="dxa" w:w="100"/>
+            </w:tcMar>
+          </w:tcPr>
+          <w:p>
+            <w:r>
+              <w:rPr>
+                <w:b w:val="false"/>
+                <w:bCs w:val="false"/>
+                <w:sz w:val="20"/>
+                <w:szCs w:val="20"/>
+              </w:rPr>
+              <w:t xml:space="preserve">100%</w:t>
+            </w:r>
+          </w:p>
+        </w:tc>
+        <w:tc>
+          <w:tcPr>
+            <w:tcW w:type="dxa" w:w="1200"/>
+            <w:tcBorders>
+              <w:top w:val="single" w:color="999999" w:sz="4"/>
+              <w:left w:val="single" w:color="999999" w:sz="4"/>
+              <w:bottom w:val="single" w:color="999999" w:sz="4"/>
+              <w:right w:val="single" w:color="999999" w:sz="4"/>
+            </w:tcBorders>
+            <w:tcMar>
+              <w:top w:type="dxa" w:w="60"/>
+              <w:left w:type="dxa" w:w="100"/>
+              <w:bottom w:type="dxa" w:w="60"/>
+              <w:right w:type="dxa" w:w="100"/>
+            </w:tcMar>
+          </w:tcPr>
+          <w:p>
+            <w:r>
+              <w:rPr>
+                <w:b w:val="false"/>
+                <w:bCs w:val="false"/>
+                <w:sz w:val="20"/>
+                <w:szCs w:val="20"/>
+              </w:rPr>
+              <w:t xml:space="preserve">94.44%</w:t>
+            </w:r>
+          </w:p>
+        </w:tc>
+        <w:tc>
+          <w:tcPr>
+            <w:tcW w:type="dxa" w:w="1200"/>
+            <w:tcBorders>
+              <w:top w:val="single" w:color="999999" w:sz="4"/>
+              <w:left w:val="single" w:color="999999" w:sz="4"/>
+              <w:bottom w:val="single" w:color="999999" w:sz="4"/>
+              <w:right w:val="single" w:color="999999" w:sz="4"/>
+            </w:tcBorders>
+            <w:tcMar>
+              <w:top w:type="dxa" w:w="60"/>
+              <w:left w:type="dxa" w:w="100"/>
+              <w:bottom w:type="dxa" w:w="60"/>
+              <w:right w:type="dxa" w:w="100"/>
+            </w:tcMar>
+          </w:tcPr>
+          <w:p>
+            <w:r>
+              <w:rPr>
+                <w:b w:val="false"/>
+                <w:bCs w:val="false"/>
+                <w:sz w:val="20"/>
+                <w:szCs w:val="20"/>
+              </w:rPr>
+              <w:t xml:space="preserve">100%</w:t>
+            </w:r>
+          </w:p>
+        </w:tc>
+        <w:tc>
+          <w:tcPr>
+            <w:tcW w:type="dxa" w:w="1200"/>
+            <w:tcBorders>
+              <w:top w:val="single" w:color="999999" w:sz="4"/>
+              <w:left w:val="single" w:color="999999" w:sz="4"/>
+              <w:bottom w:val="single" w:color="999999" w:sz="4"/>
+              <w:right w:val="single" w:color="999999" w:sz="4"/>
+            </w:tcBorders>
+            <w:tcMar>
+              <w:top w:type="dxa" w:w="60"/>
+              <w:left w:type="dxa" w:w="100"/>
+              <w:bottom w:type="dxa" w:w="60"/>
+              <w:right w:type="dxa" w:w="100"/>
+            </w:tcMar>
+          </w:tcPr>
+          <w:p>
+            <w:r>
+              <w:rPr>
+                <w:b w:val="false"/>
+                <w:bCs w:val="false"/>
+                <w:sz w:val="20"/>
+                <w:szCs w:val="20"/>
+              </w:rPr>
+              <w:t xml:space="preserve">100%</w:t>
+            </w:r>
+          </w:p>
+        </w:tc>
+      </w:tr>
+      <w:tr>
+        <w:trPr>
+          <w:tblHeader w:val="off"/>
+        </w:trPr>
+        <w:tc>
+          <w:tcPr>
+            <w:tcW w:type="dxa" w:w="3700"/>
+            <w:tcBorders>
+              <w:top w:val="single" w:color="999999" w:sz="4"/>
+              <w:left w:val="single" w:color="999999" w:sz="4"/>
+              <w:bottom w:val="single" w:color="999999" w:sz="4"/>
+              <w:right w:val="single" w:color="999999" w:sz="4"/>
+            </w:tcBorders>
+            <w:tcMar>
+              <w:top w:type="dxa" w:w="60"/>
+              <w:left w:type="dxa" w:w="100"/>
+              <w:bottom w:type="dxa" w:w="60"/>
+              <w:right w:type="dxa" w:w="100"/>
+            </w:tcMar>
+          </w:tcPr>
+          <w:p>
+            <w:r>
+              <w:rPr>
+                <w:b w:val="false"/>
+                <w:bCs w:val="false"/>
+                <w:sz w:val="20"/>
+                <w:szCs w:val="20"/>
+              </w:rPr>
+              <w:t xml:space="preserve">utils/formato.js</w:t>
+            </w:r>
+          </w:p>
+        </w:tc>
+        <w:tc>
+          <w:tcPr>
+            <w:tcW w:type="dxa" w:w="1200"/>
+            <w:tcBorders>
+              <w:top w:val="single" w:color="999999" w:sz="4"/>
+              <w:left w:val="single" w:color="999999" w:sz="4"/>
+              <w:bottom w:val="single" w:color="999999" w:sz="4"/>
+              <w:right w:val="single" w:color="999999" w:sz="4"/>
+            </w:tcBorders>
+            <w:tcMar>
+              <w:top w:type="dxa" w:w="60"/>
+              <w:left w:type="dxa" w:w="100"/>
+              <w:bottom w:type="dxa" w:w="60"/>
+              <w:right w:type="dxa" w:w="100"/>
+            </w:tcMar>
+          </w:tcPr>
+          <w:p>
+            <w:r>
+              <w:rPr>
+                <w:b w:val="false"/>
+                <w:bCs w:val="false"/>
+                <w:sz w:val="20"/>
+                <w:szCs w:val="20"/>
+              </w:rPr>
+              <w:t xml:space="preserve">100%</w:t>
+            </w:r>
+          </w:p>
+        </w:tc>
+        <w:tc>
+          <w:tcPr>
+            <w:tcW w:type="dxa" w:w="1200"/>
+            <w:tcBorders>
+              <w:top w:val="single" w:color="999999" w:sz="4"/>
+              <w:left w:val="single" w:color="999999" w:sz="4"/>
+              <w:bottom w:val="single" w:color="999999" w:sz="4"/>
+              <w:right w:val="single" w:color="999999" w:sz="4"/>
+            </w:tcBorders>
+            <w:tcMar>
+              <w:top w:type="dxa" w:w="60"/>
+              <w:left w:type="dxa" w:w="100"/>
+              <w:bottom w:type="dxa" w:w="60"/>
+              <w:right w:type="dxa" w:w="100"/>
+            </w:tcMar>
+          </w:tcPr>
+          <w:p>
+            <w:r>
+              <w:rPr>
+                <w:b w:val="false"/>
+                <w:bCs w:val="false"/>
+                <w:sz w:val="20"/>
+                <w:szCs w:val="20"/>
+              </w:rPr>
+              <w:t xml:space="preserve">100%</w:t>
+            </w:r>
+          </w:p>
+        </w:tc>
+        <w:tc>
+          <w:tcPr>
+            <w:tcW w:type="dxa" w:w="1200"/>
+            <w:tcBorders>
+              <w:top w:val="single" w:color="999999" w:sz="4"/>
+              <w:left w:val="single" w:color="999999" w:sz="4"/>
+              <w:bottom w:val="single" w:color="999999" w:sz="4"/>
+              <w:right w:val="single" w:color="999999" w:sz="4"/>
+            </w:tcBorders>
+            <w:tcMar>
+              <w:top w:type="dxa" w:w="60"/>
+              <w:left w:type="dxa" w:w="100"/>
+              <w:bottom w:type="dxa" w:w="60"/>
+              <w:right w:type="dxa" w:w="100"/>
+            </w:tcMar>
+          </w:tcPr>
+          <w:p>
+            <w:r>
+              <w:rPr>
+                <w:b w:val="false"/>
+                <w:bCs w:val="false"/>
+                <w:sz w:val="20"/>
+                <w:szCs w:val="20"/>
+              </w:rPr>
+              <w:t xml:space="preserve">100%</w:t>
+            </w:r>
+          </w:p>
+        </w:tc>
+        <w:tc>
+          <w:tcPr>
+            <w:tcW w:type="dxa" w:w="1200"/>
+            <w:tcBorders>
+              <w:top w:val="single" w:color="999999" w:sz="4"/>
+              <w:left w:val="single" w:color="999999" w:sz="4"/>
+              <w:bottom w:val="single" w:color="999999" w:sz="4"/>
+              <w:right w:val="single" w:color="999999" w:sz="4"/>
+            </w:tcBorders>
+            <w:tcMar>
+              <w:top w:type="dxa" w:w="60"/>
+              <w:left w:type="dxa" w:w="100"/>
+              <w:bottom w:type="dxa" w:w="60"/>
+              <w:right w:type="dxa" w:w="100"/>
+            </w:tcMar>
+          </w:tcPr>
+          <w:p>
+            <w:r>
+              <w:rPr>
+                <w:b w:val="false"/>
+                <w:bCs w:val="false"/>
+                <w:sz w:val="20"/>
+                <w:szCs w:val="20"/>
+              </w:rPr>
+              <w:t xml:space="preserve">100%</w:t>
+            </w:r>
+          </w:p>
+        </w:tc>
+      </w:tr>
+      <w:tr>
+        <w:trPr>
+          <w:tblHeader w:val="off"/>
+        </w:trPr>
+        <w:tc>
+          <w:tcPr>
+            <w:tcW w:type="dxa" w:w="3700"/>
+            <w:tcBorders>
+              <w:top w:val="single" w:color="999999" w:sz="4"/>
+              <w:left w:val="single" w:color="999999" w:sz="4"/>
+              <w:bottom w:val="single" w:color="999999" w:sz="4"/>
+              <w:right w:val="single" w:color="999999" w:sz="4"/>
+            </w:tcBorders>
+            <w:tcMar>
+              <w:top w:type="dxa" w:w="60"/>
+              <w:left w:type="dxa" w:w="100"/>
+              <w:bottom w:type="dxa" w:w="60"/>
+              <w:right w:type="dxa" w:w="100"/>
+            </w:tcMar>
+          </w:tcPr>
+          <w:p>
+            <w:r>
+              <w:rPr>
+                <w:b w:val="false"/>
+                <w:bCs w:val="false"/>
+                <w:sz w:val="20"/>
+                <w:szCs w:val="20"/>
+              </w:rPr>
+              <w:t xml:space="preserve">utils/pago.js</w:t>
+            </w:r>
+          </w:p>
+        </w:tc>
+        <w:tc>
+          <w:tcPr>
+            <w:tcW w:type="dxa" w:w="1200"/>
+            <w:tcBorders>
+              <w:top w:val="single" w:color="999999" w:sz="4"/>
+              <w:left w:val="single" w:color="999999" w:sz="4"/>
+              <w:bottom w:val="single" w:color="999999" w:sz="4"/>
+              <w:right w:val="single" w:color="999999" w:sz="4"/>
+            </w:tcBorders>
+            <w:tcMar>
+              <w:top w:type="dxa" w:w="60"/>
+              <w:left w:type="dxa" w:w="100"/>
+              <w:bottom w:type="dxa" w:w="60"/>
+              <w:right w:type="dxa" w:w="100"/>
+            </w:tcMar>
+          </w:tcPr>
+          <w:p>
+            <w:r>
+              <w:rPr>
+                <w:b w:val="false"/>
+                <w:bCs w:val="false"/>
+                <w:sz w:val="20"/>
+                <w:szCs w:val="20"/>
+              </w:rPr>
+              <w:t xml:space="preserve">100%</w:t>
+            </w:r>
+          </w:p>
+        </w:tc>
+        <w:tc>
+          <w:tcPr>
+            <w:tcW w:type="dxa" w:w="1200"/>
+            <w:tcBorders>
+              <w:top w:val="single" w:color="999999" w:sz="4"/>
+              <w:left w:val="single" w:color="999999" w:sz="4"/>
+              <w:bottom w:val="single" w:color="999999" w:sz="4"/>
+              <w:right w:val="single" w:color="999999" w:sz="4"/>
+            </w:tcBorders>
+            <w:tcMar>
+              <w:top w:type="dxa" w:w="60"/>
+              <w:left w:type="dxa" w:w="100"/>
+              <w:bottom w:type="dxa" w:w="60"/>
+              <w:right w:type="dxa" w:w="100"/>
+            </w:tcMar>
+          </w:tcPr>
+          <w:p>
+            <w:r>
+              <w:rPr>
+                <w:b w:val="false"/>
+                <w:bCs w:val="false"/>
+                <w:sz w:val="20"/>
+                <w:szCs w:val="20"/>
+              </w:rPr>
+              <w:t xml:space="preserve">100%</w:t>
+            </w:r>
+          </w:p>
+        </w:tc>
+        <w:tc>
+          <w:tcPr>
+            <w:tcW w:type="dxa" w:w="1200"/>
+            <w:tcBorders>
+              <w:top w:val="single" w:color="999999" w:sz="4"/>
+              <w:left w:val="single" w:color="999999" w:sz="4"/>
+              <w:bottom w:val="single" w:color="999999" w:sz="4"/>
+              <w:right w:val="single" w:color="999999" w:sz="4"/>
+            </w:tcBorders>
+            <w:tcMar>
+              <w:top w:type="dxa" w:w="60"/>
+              <w:left w:type="dxa" w:w="100"/>
+              <w:bottom w:type="dxa" w:w="60"/>
+              <w:right w:type="dxa" w:w="100"/>
+            </w:tcMar>
+          </w:tcPr>
+          <w:p>
+            <w:r>
+              <w:rPr>
+                <w:b w:val="false"/>
+                <w:bCs w:val="false"/>
+                <w:sz w:val="20"/>
+                <w:szCs w:val="20"/>
+              </w:rPr>
+              <w:t xml:space="preserve">100%</w:t>
+            </w:r>
+          </w:p>
+        </w:tc>
+        <w:tc>
+          <w:tcPr>
+            <w:tcW w:type="dxa" w:w="1200"/>
+            <w:tcBorders>
+              <w:top w:val="single" w:color="999999" w:sz="4"/>
+              <w:left w:val="single" w:color="999999" w:sz="4"/>
+              <w:bottom w:val="single" w:color="999999" w:sz="4"/>
+              <w:right w:val="single" w:color="999999" w:sz="4"/>
+            </w:tcBorders>
+            <w:tcMar>
+              <w:top w:type="dxa" w:w="60"/>
+              <w:left w:type="dxa" w:w="100"/>
+              <w:bottom w:type="dxa" w:w="60"/>
+              <w:right w:type="dxa" w:w="100"/>
+            </w:tcMar>
+          </w:tcPr>
+          <w:p>
+            <w:r>
+              <w:rPr>
+                <w:b w:val="false"/>
+                <w:bCs w:val="false"/>
+                <w:sz w:val="20"/>
+                <w:szCs w:val="20"/>
+              </w:rPr>
+              <w:t xml:space="preserve">100%</w:t>
+            </w:r>
+          </w:p>
+        </w:tc>
+      </w:tr>
+      <w:tr>
+        <w:trPr>
+          <w:tblHeader w:val="off"/>
+        </w:trPr>
+        <w:tc>
+          <w:tcPr>
+            <w:tcW w:type="dxa" w:w="3700"/>
+            <w:tcBorders>
+              <w:top w:val="single" w:color="999999" w:sz="4"/>
+              <w:left w:val="single" w:color="999999" w:sz="4"/>
+              <w:bottom w:val="single" w:color="999999" w:sz="4"/>
+              <w:right w:val="single" w:color="999999" w:sz="4"/>
+            </w:tcBorders>
+            <w:tcMar>
+              <w:top w:type="dxa" w:w="60"/>
+              <w:left w:type="dxa" w:w="100"/>
+              <w:bottom w:type="dxa" w:w="60"/>
+              <w:right w:type="dxa" w:w="100"/>
+            </w:tcMar>
+          </w:tcPr>
+          <w:p>
+            <w:r>
+              <w:rPr>
+                <w:b w:val="false"/>
+                <w:bCs w:val="false"/>
+                <w:sz w:val="20"/>
+                <w:szCs w:val="20"/>
+              </w:rPr>
               <w:t xml:space="preserve">utils/validaciones.js</w:t>
             </w:r>
           </w:p>
@@ -6463,91 +7768,91 @@
                 <w:sz w:val="20"/>
                 <w:szCs w:val="20"/>
               </w:rPr>
-              <w:t xml:space="preserve">69.87%</w:t>
-            </w:r>
-          </w:p>
-        </w:tc>
-        <w:tc>
-          <w:tcPr>
-            <w:tcW w:type="dxa" w:w="1200"/>
-            <w:tcBorders>
-              <w:top w:val="single" w:color="999999" w:sz="4"/>
-              <w:left w:val="single" w:color="999999" w:sz="4"/>
-              <w:bottom w:val="single" w:color="999999" w:sz="4"/>
-              <w:right w:val="single" w:color="999999" w:sz="4"/>
-            </w:tcBorders>
-            <w:tcMar>
-              <w:top w:type="dxa" w:w="60"/>
-              <w:left w:type="dxa" w:w="100"/>
-              <w:bottom w:type="dxa" w:w="60"/>
-              <w:right w:type="dxa" w:w="100"/>
-            </w:tcMar>
-          </w:tcPr>
-          <w:p>
-            <w:r>
-              <w:rPr>
-                <w:b w:val="false"/>
-                <w:bCs w:val="false"/>
-                <w:sz w:val="20"/>
-                <w:szCs w:val="20"/>
-              </w:rPr>
-              <w:t xml:space="preserve">70.96%</w:t>
-            </w:r>
-          </w:p>
-        </w:tc>
-        <w:tc>
-          <w:tcPr>
-            <w:tcW w:type="dxa" w:w="1200"/>
-            <w:tcBorders>
-              <w:top w:val="single" w:color="999999" w:sz="4"/>
-              <w:left w:val="single" w:color="999999" w:sz="4"/>
-              <w:bottom w:val="single" w:color="999999" w:sz="4"/>
-              <w:right w:val="single" w:color="999999" w:sz="4"/>
-            </w:tcBorders>
-            <w:tcMar>
-              <w:top w:type="dxa" w:w="60"/>
-              <w:left w:type="dxa" w:w="100"/>
-              <w:bottom w:type="dxa" w:w="60"/>
-              <w:right w:type="dxa" w:w="100"/>
-            </w:tcMar>
-          </w:tcPr>
-          <w:p>
-            <w:r>
-              <w:rPr>
-                <w:b w:val="false"/>
-                <w:bCs w:val="false"/>
-                <w:sz w:val="20"/>
-                <w:szCs w:val="20"/>
-              </w:rPr>
-              <w:t xml:space="preserve">66.66%</w:t>
-            </w:r>
-          </w:p>
-        </w:tc>
-        <w:tc>
-          <w:tcPr>
-            <w:tcW w:type="dxa" w:w="1200"/>
-            <w:tcBorders>
-              <w:top w:val="single" w:color="999999" w:sz="4"/>
-              <w:left w:val="single" w:color="999999" w:sz="4"/>
-              <w:bottom w:val="single" w:color="999999" w:sz="4"/>
-              <w:right w:val="single" w:color="999999" w:sz="4"/>
-            </w:tcBorders>
-            <w:tcMar>
-              <w:top w:type="dxa" w:w="60"/>
-              <w:left w:type="dxa" w:w="100"/>
-              <w:bottom w:type="dxa" w:w="60"/>
-              <w:right w:type="dxa" w:w="100"/>
-            </w:tcMar>
-          </w:tcPr>
-          <w:p>
-            <w:r>
-              <w:rPr>
-                <w:b w:val="false"/>
-                <w:bCs w:val="false"/>
-                <w:sz w:val="20"/>
-                <w:szCs w:val="20"/>
-              </w:rPr>
-              <w:t xml:space="preserve">74.32%</w:t>
+              <w:t xml:space="preserve">74.69%</w:t>
+            </w:r>
+          </w:p>
+        </w:tc>
+        <w:tc>
+          <w:tcPr>
+            <w:tcW w:type="dxa" w:w="1200"/>
+            <w:tcBorders>
+              <w:top w:val="single" w:color="999999" w:sz="4"/>
+              <w:left w:val="single" w:color="999999" w:sz="4"/>
+              <w:bottom w:val="single" w:color="999999" w:sz="4"/>
+              <w:right w:val="single" w:color="999999" w:sz="4"/>
+            </w:tcBorders>
+            <w:tcMar>
+              <w:top w:type="dxa" w:w="60"/>
+              <w:left w:type="dxa" w:w="100"/>
+              <w:bottom w:type="dxa" w:w="60"/>
+              <w:right w:type="dxa" w:w="100"/>
+            </w:tcMar>
+          </w:tcPr>
+          <w:p>
+            <w:r>
+              <w:rPr>
+                <w:b w:val="false"/>
+                <w:bCs w:val="false"/>
+                <w:sz w:val="20"/>
+                <w:szCs w:val="20"/>
+              </w:rPr>
+              <w:t xml:space="preserve">75.26%</w:t>
+            </w:r>
+          </w:p>
+        </w:tc>
+        <w:tc>
+          <w:tcPr>
+            <w:tcW w:type="dxa" w:w="1200"/>
+            <w:tcBorders>
+              <w:top w:val="single" w:color="999999" w:sz="4"/>
+              <w:left w:val="single" w:color="999999" w:sz="4"/>
+              <w:bottom w:val="single" w:color="999999" w:sz="4"/>
+              <w:right w:val="single" w:color="999999" w:sz="4"/>
+            </w:tcBorders>
+            <w:tcMar>
+              <w:top w:type="dxa" w:w="60"/>
+              <w:left w:type="dxa" w:w="100"/>
+              <w:bottom w:type="dxa" w:w="60"/>
+              <w:right w:type="dxa" w:w="100"/>
+            </w:tcMar>
+          </w:tcPr>
+          <w:p>
+            <w:r>
+              <w:rPr>
+                <w:b w:val="false"/>
+                <w:bCs w:val="false"/>
+                <w:sz w:val="20"/>
+                <w:szCs w:val="20"/>
+              </w:rPr>
+              <w:t xml:space="preserve">86.66%</w:t>
+            </w:r>
+          </w:p>
+        </w:tc>
+        <w:tc>
+          <w:tcPr>
+            <w:tcW w:type="dxa" w:w="1200"/>
+            <w:tcBorders>
+              <w:top w:val="single" w:color="999999" w:sz="4"/>
+              <w:left w:val="single" w:color="999999" w:sz="4"/>
+              <w:bottom w:val="single" w:color="999999" w:sz="4"/>
+              <w:right w:val="single" w:color="999999" w:sz="4"/>
+            </w:tcBorders>
+            <w:tcMar>
+              <w:top w:type="dxa" w:w="60"/>
+              <w:left w:type="dxa" w:w="100"/>
+              <w:bottom w:type="dxa" w:w="60"/>
+              <w:right w:type="dxa" w:w="100"/>
+            </w:tcMar>
+          </w:tcPr>
+          <w:p>
+            <w:r>
+              <w:rPr>
+                <w:b w:val="false"/>
+                <w:bCs w:val="false"/>
+                <w:sz w:val="20"/>
+                <w:szCs w:val="20"/>
+              </w:rPr>
+              <w:t xml:space="preserve">79.72%</w:t>
             </w:r>
           </w:p>
         </w:tc>
@@ -6610,6 +7915,19 @@
     </w:p>
     <w:p>
       <w:pPr>
+        <w:pStyle w:val="ListParagraph"/>
+        <w:numPr>
+          <w:ilvl w:val="0"/>
+          <w:numId w:val="2"/>
+        </w:numPr>
+        <w:spacing w:after="60"/>
+      </w:pPr>
+      <w:r>
+        <w:t xml:space="preserve">El mantenedor de usuarios, el historial de compras y la boleta de órdenes, todos con 100% de cobertura de sentencias.</w:t>
+      </w:r>
+    </w:p>
+    <w:p>
+      <w:pPr>
         <w:pStyle w:val="Heading2"/>
       </w:pPr>
       <w:r>
@@ -6626,7 +7944,7 @@
         <w:spacing w:after="60"/>
       </w:pPr>
       <w:r>
-        <w:t xml:space="preserve">data/usuarios.js (46%): todavía no se prueban el alta, edición y eliminación de usuarios. Se agregan junto al mantenedor de usuarios.</w:t>
+        <w:t xml:space="preserve">data/usuarios.js (84.61%): ya se prueban el alta, la búsqueda y la eliminación desde el mantenedor; falta cubrir algún caso de actualización parcial.</w:t>
       </w:r>
     </w:p>
     <w:p>
@@ -6652,7 +7970,7 @@
         <w:spacing w:after="60"/>
       </w:pPr>
       <w:r>
-        <w:t xml:space="preserve">utils/validaciones.js (70%): faltan pruebas de las validaciones de dirección, comentario, código y tarjeta de forma directa.</w:t>
+        <w:t xml:space="preserve">utils/validaciones.js (74.69%): faltan pruebas de las validaciones de dirección, comentario y tarjeta de forma directa.</w:t>
       </w:r>
     </w:p>
     <w:p>
@@ -6665,7 +7983,7 @@
         <w:spacing w:after="60"/>
       </w:pPr>
       <w:r>
-        <w:t xml:space="preserve">FormField.js (75%): falta probar los campos de tipo textarea y select directamente.</w:t>
+        <w:t xml:space="preserve">data/ordenes.js (60%): falta probar la creación de órdenes desde el checkout, todavía sin pruebas propias.</w:t>
       </w:r>
     </w:p>
     <w:p>
@@ -6715,7 +8033,7 @@
         <w:spacing w:after="60"/>
       </w:pPr>
       <w:r>
-        <w:t xml:space="preserve">Agregar pruebas del mantenedor de usuarios, del historial de compras y de la boleta, a cargo de Renato.</w:t>
+        <w:t xml:space="preserve">Mantenedor de usuarios, historial de compras y boleta: hecho (R1 y R2), con 17 pruebas nuevas.</w:t>
       </w:r>
     </w:p>
     <w:p>

</xml_diff>